<commit_message>
Update checkout dan fitur print PDF pada tiket
</commit_message>
<xml_diff>
--- a/dokumentasi/Putri Nuraini_23312243 tahap3.docx
+++ b/dokumentasi/Putri Nuraini_23312243 tahap3.docx
@@ -8,11 +8,19 @@
           <w:rFonts w:ascii="Times New Roman" w:hAnsi="Times New Roman" w:cs="Times New Roman"/>
         </w:rPr>
       </w:pPr>
-      <w:r>
-        <w:rPr>
-          <w:rFonts w:ascii="Times New Roman" w:hAnsi="Times New Roman" w:cs="Times New Roman"/>
-        </w:rPr>
-        <w:t>NAMA : PUTRI NURAINI</w:t>
+      <w:proofErr w:type="gramStart"/>
+      <w:r>
+        <w:rPr>
+          <w:rFonts w:ascii="Times New Roman" w:hAnsi="Times New Roman" w:cs="Times New Roman"/>
+        </w:rPr>
+        <w:t>NAMA :</w:t>
+      </w:r>
+      <w:proofErr w:type="gramEnd"/>
+      <w:r>
+        <w:rPr>
+          <w:rFonts w:ascii="Times New Roman" w:hAnsi="Times New Roman" w:cs="Times New Roman"/>
+        </w:rPr>
+        <w:t xml:space="preserve"> PUTRI NURAINI</w:t>
       </w:r>
     </w:p>
     <w:p>
@@ -21,11 +29,19 @@
           <w:rFonts w:ascii="Times New Roman" w:hAnsi="Times New Roman" w:cs="Times New Roman"/>
         </w:rPr>
       </w:pPr>
-      <w:r>
-        <w:rPr>
-          <w:rFonts w:ascii="Times New Roman" w:hAnsi="Times New Roman" w:cs="Times New Roman"/>
-        </w:rPr>
-        <w:t>NPM : 23312243</w:t>
+      <w:proofErr w:type="gramStart"/>
+      <w:r>
+        <w:rPr>
+          <w:rFonts w:ascii="Times New Roman" w:hAnsi="Times New Roman" w:cs="Times New Roman"/>
+        </w:rPr>
+        <w:t>NPM :</w:t>
+      </w:r>
+      <w:proofErr w:type="gramEnd"/>
+      <w:r>
+        <w:rPr>
+          <w:rFonts w:ascii="Times New Roman" w:hAnsi="Times New Roman" w:cs="Times New Roman"/>
+        </w:rPr>
+        <w:t xml:space="preserve"> 23312243</w:t>
       </w:r>
     </w:p>
     <w:p>
@@ -34,11 +50,19 @@
           <w:rFonts w:ascii="Times New Roman" w:hAnsi="Times New Roman" w:cs="Times New Roman"/>
         </w:rPr>
       </w:pPr>
-      <w:r>
-        <w:rPr>
-          <w:rFonts w:ascii="Times New Roman" w:hAnsi="Times New Roman" w:cs="Times New Roman"/>
-        </w:rPr>
-        <w:t>KELAS : IF23FX</w:t>
+      <w:proofErr w:type="gramStart"/>
+      <w:r>
+        <w:rPr>
+          <w:rFonts w:ascii="Times New Roman" w:hAnsi="Times New Roman" w:cs="Times New Roman"/>
+        </w:rPr>
+        <w:t>KELAS :</w:t>
+      </w:r>
+      <w:proofErr w:type="gramEnd"/>
+      <w:r>
+        <w:rPr>
+          <w:rFonts w:ascii="Times New Roman" w:hAnsi="Times New Roman" w:cs="Times New Roman"/>
+        </w:rPr>
+        <w:t xml:space="preserve"> IF23FX</w:t>
       </w:r>
     </w:p>
     <w:p>
@@ -47,11 +71,19 @@
           <w:rFonts w:ascii="Times New Roman" w:hAnsi="Times New Roman" w:cs="Times New Roman"/>
         </w:rPr>
       </w:pPr>
-      <w:r>
-        <w:rPr>
-          <w:rFonts w:ascii="Times New Roman" w:hAnsi="Times New Roman" w:cs="Times New Roman"/>
-        </w:rPr>
-        <w:t>TAHAP : 3</w:t>
+      <w:proofErr w:type="gramStart"/>
+      <w:r>
+        <w:rPr>
+          <w:rFonts w:ascii="Times New Roman" w:hAnsi="Times New Roman" w:cs="Times New Roman"/>
+        </w:rPr>
+        <w:t>TAHAP :</w:t>
+      </w:r>
+      <w:proofErr w:type="gramEnd"/>
+      <w:r>
+        <w:rPr>
+          <w:rFonts w:ascii="Times New Roman" w:hAnsi="Times New Roman" w:cs="Times New Roman"/>
+        </w:rPr>
+        <w:t xml:space="preserve"> 3</w:t>
       </w:r>
     </w:p>
     <w:p>
@@ -76,8 +108,16 @@
         <w:rPr>
           <w:rFonts w:ascii="Times New Roman" w:hAnsi="Times New Roman" w:cs="Times New Roman"/>
         </w:rPr>
-        <w:t>Fitur Pencarian</w:t>
-      </w:r>
+        <w:t xml:space="preserve">Fitur </w:t>
+      </w:r>
+      <w:proofErr w:type="spellStart"/>
+      <w:r>
+        <w:rPr>
+          <w:rFonts w:ascii="Times New Roman" w:hAnsi="Times New Roman" w:cs="Times New Roman"/>
+        </w:rPr>
+        <w:t>Pencarian</w:t>
+      </w:r>
+      <w:proofErr w:type="spellEnd"/>
     </w:p>
     <w:p>
       <w:pPr>
@@ -139,7 +179,77 @@
         <w:rPr>
           <w:rFonts w:ascii="Times New Roman" w:hAnsi="Times New Roman" w:cs="Times New Roman"/>
         </w:rPr>
-        <w:t xml:space="preserve">Fitur pencarian berhasil diimplementasikan dengan menambahkan </w:t>
+        <w:t xml:space="preserve">Fitur </w:t>
+      </w:r>
+      <w:proofErr w:type="spellStart"/>
+      <w:r>
+        <w:rPr>
+          <w:rFonts w:ascii="Times New Roman" w:hAnsi="Times New Roman" w:cs="Times New Roman"/>
+        </w:rPr>
+        <w:t>pencarian</w:t>
+      </w:r>
+      <w:proofErr w:type="spellEnd"/>
+      <w:r>
+        <w:rPr>
+          <w:rFonts w:ascii="Times New Roman" w:hAnsi="Times New Roman" w:cs="Times New Roman"/>
+        </w:rPr>
+        <w:t xml:space="preserve"> </w:t>
+      </w:r>
+      <w:proofErr w:type="spellStart"/>
+      <w:r>
+        <w:rPr>
+          <w:rFonts w:ascii="Times New Roman" w:hAnsi="Times New Roman" w:cs="Times New Roman"/>
+        </w:rPr>
+        <w:t>berhasil</w:t>
+      </w:r>
+      <w:proofErr w:type="spellEnd"/>
+      <w:r>
+        <w:rPr>
+          <w:rFonts w:ascii="Times New Roman" w:hAnsi="Times New Roman" w:cs="Times New Roman"/>
+        </w:rPr>
+        <w:t xml:space="preserve"> </w:t>
+      </w:r>
+      <w:proofErr w:type="spellStart"/>
+      <w:r>
+        <w:rPr>
+          <w:rFonts w:ascii="Times New Roman" w:hAnsi="Times New Roman" w:cs="Times New Roman"/>
+        </w:rPr>
+        <w:t>diimplementasikan</w:t>
+      </w:r>
+      <w:proofErr w:type="spellEnd"/>
+      <w:r>
+        <w:rPr>
+          <w:rFonts w:ascii="Times New Roman" w:hAnsi="Times New Roman" w:cs="Times New Roman"/>
+        </w:rPr>
+        <w:t xml:space="preserve"> </w:t>
+      </w:r>
+      <w:proofErr w:type="spellStart"/>
+      <w:r>
+        <w:rPr>
+          <w:rFonts w:ascii="Times New Roman" w:hAnsi="Times New Roman" w:cs="Times New Roman"/>
+        </w:rPr>
+        <w:t>dengan</w:t>
+      </w:r>
+      <w:proofErr w:type="spellEnd"/>
+      <w:r>
+        <w:rPr>
+          <w:rFonts w:ascii="Times New Roman" w:hAnsi="Times New Roman" w:cs="Times New Roman"/>
+        </w:rPr>
+        <w:t xml:space="preserve"> </w:t>
+      </w:r>
+      <w:proofErr w:type="spellStart"/>
+      <w:r>
+        <w:rPr>
+          <w:rFonts w:ascii="Times New Roman" w:hAnsi="Times New Roman" w:cs="Times New Roman"/>
+        </w:rPr>
+        <w:t>menambahkan</w:t>
+      </w:r>
+      <w:proofErr w:type="spellEnd"/>
+      <w:r>
+        <w:rPr>
+          <w:rFonts w:ascii="Times New Roman" w:hAnsi="Times New Roman" w:cs="Times New Roman"/>
+        </w:rPr>
+        <w:t xml:space="preserve"> </w:t>
       </w:r>
       <w:r>
         <w:rPr>
@@ -153,7 +263,183 @@
         <w:rPr>
           <w:rFonts w:ascii="Times New Roman" w:hAnsi="Times New Roman" w:cs="Times New Roman"/>
         </w:rPr>
-        <w:t xml:space="preserve"> dan fungsi .filter() pada data wisata. Hasil pengujian menunjukkan daftar wisata terfilter secara otomatis sesuai kata kunci yang dimasukkan pengguna.</w:t>
+        <w:t xml:space="preserve"> dan </w:t>
+      </w:r>
+      <w:proofErr w:type="spellStart"/>
+      <w:proofErr w:type="gramStart"/>
+      <w:r>
+        <w:rPr>
+          <w:rFonts w:ascii="Times New Roman" w:hAnsi="Times New Roman" w:cs="Times New Roman"/>
+        </w:rPr>
+        <w:t>fungsi</w:t>
+      </w:r>
+      <w:proofErr w:type="spellEnd"/>
+      <w:r>
+        <w:rPr>
+          <w:rFonts w:ascii="Times New Roman" w:hAnsi="Times New Roman" w:cs="Times New Roman"/>
+        </w:rPr>
+        <w:t xml:space="preserve"> .filter</w:t>
+      </w:r>
+      <w:proofErr w:type="gramEnd"/>
+      <w:r>
+        <w:rPr>
+          <w:rFonts w:ascii="Times New Roman" w:hAnsi="Times New Roman" w:cs="Times New Roman"/>
+        </w:rPr>
+        <w:t xml:space="preserve">() pada data </w:t>
+      </w:r>
+      <w:proofErr w:type="spellStart"/>
+      <w:r>
+        <w:rPr>
+          <w:rFonts w:ascii="Times New Roman" w:hAnsi="Times New Roman" w:cs="Times New Roman"/>
+        </w:rPr>
+        <w:t>wisata</w:t>
+      </w:r>
+      <w:proofErr w:type="spellEnd"/>
+      <w:r>
+        <w:rPr>
+          <w:rFonts w:ascii="Times New Roman" w:hAnsi="Times New Roman" w:cs="Times New Roman"/>
+        </w:rPr>
+        <w:t xml:space="preserve">. Hasil </w:t>
+      </w:r>
+      <w:proofErr w:type="spellStart"/>
+      <w:r>
+        <w:rPr>
+          <w:rFonts w:ascii="Times New Roman" w:hAnsi="Times New Roman" w:cs="Times New Roman"/>
+        </w:rPr>
+        <w:t>pengujian</w:t>
+      </w:r>
+      <w:proofErr w:type="spellEnd"/>
+      <w:r>
+        <w:rPr>
+          <w:rFonts w:ascii="Times New Roman" w:hAnsi="Times New Roman" w:cs="Times New Roman"/>
+        </w:rPr>
+        <w:t xml:space="preserve"> </w:t>
+      </w:r>
+      <w:proofErr w:type="spellStart"/>
+      <w:r>
+        <w:rPr>
+          <w:rFonts w:ascii="Times New Roman" w:hAnsi="Times New Roman" w:cs="Times New Roman"/>
+        </w:rPr>
+        <w:t>menunjukkan</w:t>
+      </w:r>
+      <w:proofErr w:type="spellEnd"/>
+      <w:r>
+        <w:rPr>
+          <w:rFonts w:ascii="Times New Roman" w:hAnsi="Times New Roman" w:cs="Times New Roman"/>
+        </w:rPr>
+        <w:t xml:space="preserve"> daftar </w:t>
+      </w:r>
+      <w:proofErr w:type="spellStart"/>
+      <w:r>
+        <w:rPr>
+          <w:rFonts w:ascii="Times New Roman" w:hAnsi="Times New Roman" w:cs="Times New Roman"/>
+        </w:rPr>
+        <w:t>wisata</w:t>
+      </w:r>
+      <w:proofErr w:type="spellEnd"/>
+      <w:r>
+        <w:rPr>
+          <w:rFonts w:ascii="Times New Roman" w:hAnsi="Times New Roman" w:cs="Times New Roman"/>
+        </w:rPr>
+        <w:t xml:space="preserve"> </w:t>
+      </w:r>
+      <w:proofErr w:type="spellStart"/>
+      <w:r>
+        <w:rPr>
+          <w:rFonts w:ascii="Times New Roman" w:hAnsi="Times New Roman" w:cs="Times New Roman"/>
+        </w:rPr>
+        <w:t>terfilter</w:t>
+      </w:r>
+      <w:proofErr w:type="spellEnd"/>
+      <w:r>
+        <w:rPr>
+          <w:rFonts w:ascii="Times New Roman" w:hAnsi="Times New Roman" w:cs="Times New Roman"/>
+        </w:rPr>
+        <w:t xml:space="preserve"> </w:t>
+      </w:r>
+      <w:proofErr w:type="spellStart"/>
+      <w:r>
+        <w:rPr>
+          <w:rFonts w:ascii="Times New Roman" w:hAnsi="Times New Roman" w:cs="Times New Roman"/>
+        </w:rPr>
+        <w:t>secara</w:t>
+      </w:r>
+      <w:proofErr w:type="spellEnd"/>
+      <w:r>
+        <w:rPr>
+          <w:rFonts w:ascii="Times New Roman" w:hAnsi="Times New Roman" w:cs="Times New Roman"/>
+        </w:rPr>
+        <w:t xml:space="preserve"> </w:t>
+      </w:r>
+      <w:proofErr w:type="spellStart"/>
+      <w:r>
+        <w:rPr>
+          <w:rFonts w:ascii="Times New Roman" w:hAnsi="Times New Roman" w:cs="Times New Roman"/>
+        </w:rPr>
+        <w:t>otomatis</w:t>
+      </w:r>
+      <w:proofErr w:type="spellEnd"/>
+      <w:r>
+        <w:rPr>
+          <w:rFonts w:ascii="Times New Roman" w:hAnsi="Times New Roman" w:cs="Times New Roman"/>
+        </w:rPr>
+        <w:t xml:space="preserve"> </w:t>
+      </w:r>
+      <w:proofErr w:type="spellStart"/>
+      <w:r>
+        <w:rPr>
+          <w:rFonts w:ascii="Times New Roman" w:hAnsi="Times New Roman" w:cs="Times New Roman"/>
+        </w:rPr>
+        <w:t>sesuai</w:t>
+      </w:r>
+      <w:proofErr w:type="spellEnd"/>
+      <w:r>
+        <w:rPr>
+          <w:rFonts w:ascii="Times New Roman" w:hAnsi="Times New Roman" w:cs="Times New Roman"/>
+        </w:rPr>
+        <w:t xml:space="preserve"> kata </w:t>
+      </w:r>
+      <w:proofErr w:type="spellStart"/>
+      <w:r>
+        <w:rPr>
+          <w:rFonts w:ascii="Times New Roman" w:hAnsi="Times New Roman" w:cs="Times New Roman"/>
+        </w:rPr>
+        <w:t>kunci</w:t>
+      </w:r>
+      <w:proofErr w:type="spellEnd"/>
+      <w:r>
+        <w:rPr>
+          <w:rFonts w:ascii="Times New Roman" w:hAnsi="Times New Roman" w:cs="Times New Roman"/>
+        </w:rPr>
+        <w:t xml:space="preserve"> yang </w:t>
+      </w:r>
+      <w:proofErr w:type="spellStart"/>
+      <w:r>
+        <w:rPr>
+          <w:rFonts w:ascii="Times New Roman" w:hAnsi="Times New Roman" w:cs="Times New Roman"/>
+        </w:rPr>
+        <w:t>dimasukkan</w:t>
+      </w:r>
+      <w:proofErr w:type="spellEnd"/>
+      <w:r>
+        <w:rPr>
+          <w:rFonts w:ascii="Times New Roman" w:hAnsi="Times New Roman" w:cs="Times New Roman"/>
+        </w:rPr>
+        <w:t xml:space="preserve"> </w:t>
+      </w:r>
+      <w:proofErr w:type="spellStart"/>
+      <w:r>
+        <w:rPr>
+          <w:rFonts w:ascii="Times New Roman" w:hAnsi="Times New Roman" w:cs="Times New Roman"/>
+        </w:rPr>
+        <w:t>pengguna</w:t>
+      </w:r>
+      <w:proofErr w:type="spellEnd"/>
+      <w:r>
+        <w:rPr>
+          <w:rFonts w:ascii="Times New Roman" w:hAnsi="Times New Roman" w:cs="Times New Roman"/>
+        </w:rPr>
+        <w:t>.</w:t>
       </w:r>
     </w:p>
     <w:p>
@@ -171,8 +457,30 @@
         <w:rPr>
           <w:rFonts w:ascii="Times New Roman" w:hAnsi="Times New Roman" w:cs="Times New Roman"/>
         </w:rPr>
-        <w:t>Fitur berdasarkan kategori</w:t>
-      </w:r>
+        <w:t xml:space="preserve">Fitur </w:t>
+      </w:r>
+      <w:proofErr w:type="spellStart"/>
+      <w:r>
+        <w:rPr>
+          <w:rFonts w:ascii="Times New Roman" w:hAnsi="Times New Roman" w:cs="Times New Roman"/>
+        </w:rPr>
+        <w:t>berdasarkan</w:t>
+      </w:r>
+      <w:proofErr w:type="spellEnd"/>
+      <w:r>
+        <w:rPr>
+          <w:rFonts w:ascii="Times New Roman" w:hAnsi="Times New Roman" w:cs="Times New Roman"/>
+        </w:rPr>
+        <w:t xml:space="preserve"> </w:t>
+      </w:r>
+      <w:proofErr w:type="spellStart"/>
+      <w:r>
+        <w:rPr>
+          <w:rFonts w:ascii="Times New Roman" w:hAnsi="Times New Roman" w:cs="Times New Roman"/>
+        </w:rPr>
+        <w:t>kategori</w:t>
+      </w:r>
+      <w:proofErr w:type="spellEnd"/>
     </w:p>
     <w:tbl>
       <w:tblPr>
@@ -367,7 +675,315 @@
         <w:rPr>
           <w:rFonts w:ascii="Times New Roman" w:hAnsi="Times New Roman" w:cs="Times New Roman"/>
         </w:rPr>
-        <w:t>Fitur filter kategori berhasil diimplementasikan dengan menambahkan state dan fungsi loadKategori untuk menyaring data wisata. Hasil pengujian menunjukkan daftar wisata kini terfilter secara otomatis dan rapi sesuai kategori yang dipilih pengguna.</w:t>
+        <w:t xml:space="preserve">Fitur filter </w:t>
+      </w:r>
+      <w:proofErr w:type="spellStart"/>
+      <w:r>
+        <w:rPr>
+          <w:rFonts w:ascii="Times New Roman" w:hAnsi="Times New Roman" w:cs="Times New Roman"/>
+        </w:rPr>
+        <w:t>kategori</w:t>
+      </w:r>
+      <w:proofErr w:type="spellEnd"/>
+      <w:r>
+        <w:rPr>
+          <w:rFonts w:ascii="Times New Roman" w:hAnsi="Times New Roman" w:cs="Times New Roman"/>
+        </w:rPr>
+        <w:t xml:space="preserve"> </w:t>
+      </w:r>
+      <w:proofErr w:type="spellStart"/>
+      <w:r>
+        <w:rPr>
+          <w:rFonts w:ascii="Times New Roman" w:hAnsi="Times New Roman" w:cs="Times New Roman"/>
+        </w:rPr>
+        <w:t>berhasil</w:t>
+      </w:r>
+      <w:proofErr w:type="spellEnd"/>
+      <w:r>
+        <w:rPr>
+          <w:rFonts w:ascii="Times New Roman" w:hAnsi="Times New Roman" w:cs="Times New Roman"/>
+        </w:rPr>
+        <w:t xml:space="preserve"> </w:t>
+      </w:r>
+      <w:proofErr w:type="spellStart"/>
+      <w:r>
+        <w:rPr>
+          <w:rFonts w:ascii="Times New Roman" w:hAnsi="Times New Roman" w:cs="Times New Roman"/>
+        </w:rPr>
+        <w:t>diimplementasikan</w:t>
+      </w:r>
+      <w:proofErr w:type="spellEnd"/>
+      <w:r>
+        <w:rPr>
+          <w:rFonts w:ascii="Times New Roman" w:hAnsi="Times New Roman" w:cs="Times New Roman"/>
+        </w:rPr>
+        <w:t xml:space="preserve"> </w:t>
+      </w:r>
+      <w:proofErr w:type="spellStart"/>
+      <w:r>
+        <w:rPr>
+          <w:rFonts w:ascii="Times New Roman" w:hAnsi="Times New Roman" w:cs="Times New Roman"/>
+        </w:rPr>
+        <w:t>dengan</w:t>
+      </w:r>
+      <w:proofErr w:type="spellEnd"/>
+      <w:r>
+        <w:rPr>
+          <w:rFonts w:ascii="Times New Roman" w:hAnsi="Times New Roman" w:cs="Times New Roman"/>
+        </w:rPr>
+        <w:t xml:space="preserve"> </w:t>
+      </w:r>
+      <w:proofErr w:type="spellStart"/>
+      <w:r>
+        <w:rPr>
+          <w:rFonts w:ascii="Times New Roman" w:hAnsi="Times New Roman" w:cs="Times New Roman"/>
+        </w:rPr>
+        <w:t>menambahkan</w:t>
+      </w:r>
+      <w:proofErr w:type="spellEnd"/>
+      <w:r>
+        <w:rPr>
+          <w:rFonts w:ascii="Times New Roman" w:hAnsi="Times New Roman" w:cs="Times New Roman"/>
+        </w:rPr>
+        <w:t xml:space="preserve"> state dan </w:t>
+      </w:r>
+      <w:proofErr w:type="spellStart"/>
+      <w:r>
+        <w:rPr>
+          <w:rFonts w:ascii="Times New Roman" w:hAnsi="Times New Roman" w:cs="Times New Roman"/>
+        </w:rPr>
+        <w:t>fungsi</w:t>
+      </w:r>
+      <w:proofErr w:type="spellEnd"/>
+      <w:r>
+        <w:rPr>
+          <w:rFonts w:ascii="Times New Roman" w:hAnsi="Times New Roman" w:cs="Times New Roman"/>
+        </w:rPr>
+        <w:t xml:space="preserve"> </w:t>
+      </w:r>
+      <w:proofErr w:type="spellStart"/>
+      <w:r>
+        <w:rPr>
+          <w:rFonts w:ascii="Times New Roman" w:hAnsi="Times New Roman" w:cs="Times New Roman"/>
+        </w:rPr>
+        <w:t>loadKategori</w:t>
+      </w:r>
+      <w:proofErr w:type="spellEnd"/>
+      <w:r>
+        <w:rPr>
+          <w:rFonts w:ascii="Times New Roman" w:hAnsi="Times New Roman" w:cs="Times New Roman"/>
+        </w:rPr>
+        <w:t xml:space="preserve"> </w:t>
+      </w:r>
+      <w:proofErr w:type="spellStart"/>
+      <w:r>
+        <w:rPr>
+          <w:rFonts w:ascii="Times New Roman" w:hAnsi="Times New Roman" w:cs="Times New Roman"/>
+        </w:rPr>
+        <w:t>untuk</w:t>
+      </w:r>
+      <w:proofErr w:type="spellEnd"/>
+      <w:r>
+        <w:rPr>
+          <w:rFonts w:ascii="Times New Roman" w:hAnsi="Times New Roman" w:cs="Times New Roman"/>
+        </w:rPr>
+        <w:t xml:space="preserve"> </w:t>
+      </w:r>
+      <w:proofErr w:type="spellStart"/>
+      <w:r>
+        <w:rPr>
+          <w:rFonts w:ascii="Times New Roman" w:hAnsi="Times New Roman" w:cs="Times New Roman"/>
+        </w:rPr>
+        <w:t>menyaring</w:t>
+      </w:r>
+      <w:proofErr w:type="spellEnd"/>
+      <w:r>
+        <w:rPr>
+          <w:rFonts w:ascii="Times New Roman" w:hAnsi="Times New Roman" w:cs="Times New Roman"/>
+        </w:rPr>
+        <w:t xml:space="preserve"> data </w:t>
+      </w:r>
+      <w:proofErr w:type="spellStart"/>
+      <w:r>
+        <w:rPr>
+          <w:rFonts w:ascii="Times New Roman" w:hAnsi="Times New Roman" w:cs="Times New Roman"/>
+        </w:rPr>
+        <w:t>wisata</w:t>
+      </w:r>
+      <w:proofErr w:type="spellEnd"/>
+      <w:r>
+        <w:rPr>
+          <w:rFonts w:ascii="Times New Roman" w:hAnsi="Times New Roman" w:cs="Times New Roman"/>
+        </w:rPr>
+        <w:t xml:space="preserve">. Hasil </w:t>
+      </w:r>
+      <w:proofErr w:type="spellStart"/>
+      <w:r>
+        <w:rPr>
+          <w:rFonts w:ascii="Times New Roman" w:hAnsi="Times New Roman" w:cs="Times New Roman"/>
+        </w:rPr>
+        <w:t>pengujian</w:t>
+      </w:r>
+      <w:proofErr w:type="spellEnd"/>
+      <w:r>
+        <w:rPr>
+          <w:rFonts w:ascii="Times New Roman" w:hAnsi="Times New Roman" w:cs="Times New Roman"/>
+        </w:rPr>
+        <w:t xml:space="preserve"> </w:t>
+      </w:r>
+      <w:proofErr w:type="spellStart"/>
+      <w:r>
+        <w:rPr>
+          <w:rFonts w:ascii="Times New Roman" w:hAnsi="Times New Roman" w:cs="Times New Roman"/>
+        </w:rPr>
+        <w:t>menunjukkan</w:t>
+      </w:r>
+      <w:proofErr w:type="spellEnd"/>
+      <w:r>
+        <w:rPr>
+          <w:rFonts w:ascii="Times New Roman" w:hAnsi="Times New Roman" w:cs="Times New Roman"/>
+        </w:rPr>
+        <w:t xml:space="preserve"> daftar </w:t>
+      </w:r>
+      <w:proofErr w:type="spellStart"/>
+      <w:r>
+        <w:rPr>
+          <w:rFonts w:ascii="Times New Roman" w:hAnsi="Times New Roman" w:cs="Times New Roman"/>
+        </w:rPr>
+        <w:t>wisata</w:t>
+      </w:r>
+      <w:proofErr w:type="spellEnd"/>
+      <w:r>
+        <w:rPr>
+          <w:rFonts w:ascii="Times New Roman" w:hAnsi="Times New Roman" w:cs="Times New Roman"/>
+        </w:rPr>
+        <w:t xml:space="preserve"> </w:t>
+      </w:r>
+      <w:proofErr w:type="spellStart"/>
+      <w:r>
+        <w:rPr>
+          <w:rFonts w:ascii="Times New Roman" w:hAnsi="Times New Roman" w:cs="Times New Roman"/>
+        </w:rPr>
+        <w:t>kini</w:t>
+      </w:r>
+      <w:proofErr w:type="spellEnd"/>
+      <w:r>
+        <w:rPr>
+          <w:rFonts w:ascii="Times New Roman" w:hAnsi="Times New Roman" w:cs="Times New Roman"/>
+        </w:rPr>
+        <w:t xml:space="preserve"> </w:t>
+      </w:r>
+      <w:proofErr w:type="spellStart"/>
+      <w:r>
+        <w:rPr>
+          <w:rFonts w:ascii="Times New Roman" w:hAnsi="Times New Roman" w:cs="Times New Roman"/>
+        </w:rPr>
+        <w:t>terfilter</w:t>
+      </w:r>
+      <w:proofErr w:type="spellEnd"/>
+      <w:r>
+        <w:rPr>
+          <w:rFonts w:ascii="Times New Roman" w:hAnsi="Times New Roman" w:cs="Times New Roman"/>
+        </w:rPr>
+        <w:t xml:space="preserve"> </w:t>
+      </w:r>
+      <w:proofErr w:type="spellStart"/>
+      <w:r>
+        <w:rPr>
+          <w:rFonts w:ascii="Times New Roman" w:hAnsi="Times New Roman" w:cs="Times New Roman"/>
+        </w:rPr>
+        <w:t>secara</w:t>
+      </w:r>
+      <w:proofErr w:type="spellEnd"/>
+      <w:r>
+        <w:rPr>
+          <w:rFonts w:ascii="Times New Roman" w:hAnsi="Times New Roman" w:cs="Times New Roman"/>
+        </w:rPr>
+        <w:t xml:space="preserve"> </w:t>
+      </w:r>
+      <w:proofErr w:type="spellStart"/>
+      <w:r>
+        <w:rPr>
+          <w:rFonts w:ascii="Times New Roman" w:hAnsi="Times New Roman" w:cs="Times New Roman"/>
+        </w:rPr>
+        <w:t>otomatis</w:t>
+      </w:r>
+      <w:proofErr w:type="spellEnd"/>
+      <w:r>
+        <w:rPr>
+          <w:rFonts w:ascii="Times New Roman" w:hAnsi="Times New Roman" w:cs="Times New Roman"/>
+        </w:rPr>
+        <w:t xml:space="preserve"> dan </w:t>
+      </w:r>
+      <w:proofErr w:type="spellStart"/>
+      <w:r>
+        <w:rPr>
+          <w:rFonts w:ascii="Times New Roman" w:hAnsi="Times New Roman" w:cs="Times New Roman"/>
+        </w:rPr>
+        <w:t>rapi</w:t>
+      </w:r>
+      <w:proofErr w:type="spellEnd"/>
+      <w:r>
+        <w:rPr>
+          <w:rFonts w:ascii="Times New Roman" w:hAnsi="Times New Roman" w:cs="Times New Roman"/>
+        </w:rPr>
+        <w:t xml:space="preserve"> </w:t>
+      </w:r>
+      <w:proofErr w:type="spellStart"/>
+      <w:r>
+        <w:rPr>
+          <w:rFonts w:ascii="Times New Roman" w:hAnsi="Times New Roman" w:cs="Times New Roman"/>
+        </w:rPr>
+        <w:t>sesuai</w:t>
+      </w:r>
+      <w:proofErr w:type="spellEnd"/>
+      <w:r>
+        <w:rPr>
+          <w:rFonts w:ascii="Times New Roman" w:hAnsi="Times New Roman" w:cs="Times New Roman"/>
+        </w:rPr>
+        <w:t xml:space="preserve"> </w:t>
+      </w:r>
+      <w:proofErr w:type="spellStart"/>
+      <w:r>
+        <w:rPr>
+          <w:rFonts w:ascii="Times New Roman" w:hAnsi="Times New Roman" w:cs="Times New Roman"/>
+        </w:rPr>
+        <w:t>kategori</w:t>
+      </w:r>
+      <w:proofErr w:type="spellEnd"/>
+      <w:r>
+        <w:rPr>
+          <w:rFonts w:ascii="Times New Roman" w:hAnsi="Times New Roman" w:cs="Times New Roman"/>
+        </w:rPr>
+        <w:t xml:space="preserve"> yang </w:t>
+      </w:r>
+      <w:proofErr w:type="spellStart"/>
+      <w:r>
+        <w:rPr>
+          <w:rFonts w:ascii="Times New Roman" w:hAnsi="Times New Roman" w:cs="Times New Roman"/>
+        </w:rPr>
+        <w:t>dipilih</w:t>
+      </w:r>
+      <w:proofErr w:type="spellEnd"/>
+      <w:r>
+        <w:rPr>
+          <w:rFonts w:ascii="Times New Roman" w:hAnsi="Times New Roman" w:cs="Times New Roman"/>
+        </w:rPr>
+        <w:t xml:space="preserve"> </w:t>
+      </w:r>
+      <w:proofErr w:type="spellStart"/>
+      <w:r>
+        <w:rPr>
+          <w:rFonts w:ascii="Times New Roman" w:hAnsi="Times New Roman" w:cs="Times New Roman"/>
+        </w:rPr>
+        <w:t>pengguna</w:t>
+      </w:r>
+      <w:proofErr w:type="spellEnd"/>
+      <w:r>
+        <w:rPr>
+          <w:rFonts w:ascii="Times New Roman" w:hAnsi="Times New Roman" w:cs="Times New Roman"/>
+        </w:rPr>
+        <w:t>.</w:t>
       </w:r>
     </w:p>
     <w:p>
@@ -456,8 +1072,25 @@
         <w:t>Backend</w:t>
       </w:r>
       <w:r>
-        <w:t xml:space="preserve">: Berhasil menambahkan field </w:t>
-      </w:r>
+        <w:t xml:space="preserve">: </w:t>
+      </w:r>
+      <w:proofErr w:type="spellStart"/>
+      <w:r>
+        <w:t>Berhasil</w:t>
+      </w:r>
+      <w:proofErr w:type="spellEnd"/>
+      <w:r>
+        <w:t xml:space="preserve"> </w:t>
+      </w:r>
+      <w:proofErr w:type="spellStart"/>
+      <w:r>
+        <w:t>menambahkan</w:t>
+      </w:r>
+      <w:proofErr w:type="spellEnd"/>
+      <w:r>
+        <w:t xml:space="preserve"> field </w:t>
+      </w:r>
+      <w:proofErr w:type="spellStart"/>
       <w:r>
         <w:rPr>
           <w:rStyle w:val="HTMLCode"/>
@@ -465,8 +1098,73 @@
         </w:rPr>
         <w:t>gambar</w:t>
       </w:r>
-      <w:r>
-        <w:t xml:space="preserve"> pada skema database dan memperbarui API service untuk mendukung penyimpanan URL gambar melalui metode </w:t>
+      <w:proofErr w:type="spellEnd"/>
+      <w:r>
+        <w:t xml:space="preserve"> pada </w:t>
+      </w:r>
+      <w:proofErr w:type="spellStart"/>
+      <w:r>
+        <w:t>skema</w:t>
+      </w:r>
+      <w:proofErr w:type="spellEnd"/>
+      <w:r>
+        <w:t xml:space="preserve"> database dan </w:t>
+      </w:r>
+      <w:proofErr w:type="spellStart"/>
+      <w:r>
+        <w:t>memperbarui</w:t>
+      </w:r>
+      <w:proofErr w:type="spellEnd"/>
+      <w:r>
+        <w:t xml:space="preserve"> API service </w:t>
+      </w:r>
+      <w:proofErr w:type="spellStart"/>
+      <w:r>
+        <w:t>untuk</w:t>
+      </w:r>
+      <w:proofErr w:type="spellEnd"/>
+      <w:r>
+        <w:t xml:space="preserve"> </w:t>
+      </w:r>
+      <w:proofErr w:type="spellStart"/>
+      <w:r>
+        <w:t>mendukung</w:t>
+      </w:r>
+      <w:proofErr w:type="spellEnd"/>
+      <w:r>
+        <w:t xml:space="preserve"> </w:t>
+      </w:r>
+      <w:proofErr w:type="spellStart"/>
+      <w:r>
+        <w:t>penyimpanan</w:t>
+      </w:r>
+      <w:proofErr w:type="spellEnd"/>
+      <w:r>
+        <w:t xml:space="preserve"> URL </w:t>
+      </w:r>
+      <w:proofErr w:type="spellStart"/>
+      <w:r>
+        <w:t>gambar</w:t>
+      </w:r>
+      <w:proofErr w:type="spellEnd"/>
+      <w:r>
+        <w:t xml:space="preserve"> </w:t>
+      </w:r>
+      <w:proofErr w:type="spellStart"/>
+      <w:r>
+        <w:t>melalui</w:t>
+      </w:r>
+      <w:proofErr w:type="spellEnd"/>
+      <w:r>
+        <w:t xml:space="preserve"> </w:t>
+      </w:r>
+      <w:proofErr w:type="spellStart"/>
+      <w:r>
+        <w:t>metode</w:t>
+      </w:r>
+      <w:proofErr w:type="spellEnd"/>
+      <w:r>
+        <w:t xml:space="preserve"> </w:t>
       </w:r>
       <w:r>
         <w:rPr>
@@ -476,7 +1174,15 @@
         <w:t>input</w:t>
       </w:r>
       <w:r>
-        <w:t xml:space="preserve"> teks.</w:t>
+        <w:t xml:space="preserve"> </w:t>
+      </w:r>
+      <w:proofErr w:type="spellStart"/>
+      <w:r>
+        <w:t>teks</w:t>
+      </w:r>
+      <w:proofErr w:type="spellEnd"/>
+      <w:r>
+        <w:t>.</w:t>
       </w:r>
     </w:p>
     <w:p>
@@ -496,7 +1202,79 @@
         <w:t>Frontend</w:t>
       </w:r>
       <w:r>
-        <w:t>: Berhasil mengintegrasikan input URL gambar pada form admin, memungkinkan manajemen visual data wisata yang terhubung langsung ke basis data.</w:t>
+        <w:t xml:space="preserve">: </w:t>
+      </w:r>
+      <w:proofErr w:type="spellStart"/>
+      <w:r>
+        <w:t>Berhasil</w:t>
+      </w:r>
+      <w:proofErr w:type="spellEnd"/>
+      <w:r>
+        <w:t xml:space="preserve"> </w:t>
+      </w:r>
+      <w:proofErr w:type="spellStart"/>
+      <w:r>
+        <w:t>mengintegrasikan</w:t>
+      </w:r>
+      <w:proofErr w:type="spellEnd"/>
+      <w:r>
+        <w:t xml:space="preserve"> input URL </w:t>
+      </w:r>
+      <w:proofErr w:type="spellStart"/>
+      <w:r>
+        <w:t>gambar</w:t>
+      </w:r>
+      <w:proofErr w:type="spellEnd"/>
+      <w:r>
+        <w:t xml:space="preserve"> pada form admin, </w:t>
+      </w:r>
+      <w:proofErr w:type="spellStart"/>
+      <w:r>
+        <w:t>memungkinkan</w:t>
+      </w:r>
+      <w:proofErr w:type="spellEnd"/>
+      <w:r>
+        <w:t xml:space="preserve"> </w:t>
+      </w:r>
+      <w:proofErr w:type="spellStart"/>
+      <w:r>
+        <w:t>manajemen</w:t>
+      </w:r>
+      <w:proofErr w:type="spellEnd"/>
+      <w:r>
+        <w:t xml:space="preserve"> visual data </w:t>
+      </w:r>
+      <w:proofErr w:type="spellStart"/>
+      <w:r>
+        <w:t>wisata</w:t>
+      </w:r>
+      <w:proofErr w:type="spellEnd"/>
+      <w:r>
+        <w:t xml:space="preserve"> yang </w:t>
+      </w:r>
+      <w:proofErr w:type="spellStart"/>
+      <w:r>
+        <w:t>terhubung</w:t>
+      </w:r>
+      <w:proofErr w:type="spellEnd"/>
+      <w:r>
+        <w:t xml:space="preserve"> </w:t>
+      </w:r>
+      <w:proofErr w:type="spellStart"/>
+      <w:r>
+        <w:t>langsung</w:t>
+      </w:r>
+      <w:proofErr w:type="spellEnd"/>
+      <w:r>
+        <w:t xml:space="preserve"> </w:t>
+      </w:r>
+      <w:proofErr w:type="spellStart"/>
+      <w:r>
+        <w:t>ke</w:t>
+      </w:r>
+      <w:proofErr w:type="spellEnd"/>
+      <w:r>
+        <w:t xml:space="preserve"> basis data.</w:t>
       </w:r>
     </w:p>
     <w:p>
@@ -508,9 +1286,19 @@
         </w:numPr>
         <w:jc w:val="both"/>
       </w:pPr>
-      <w:r>
-        <w:t>Galeri Wisata</w:t>
-      </w:r>
+      <w:proofErr w:type="spellStart"/>
+      <w:r>
+        <w:t>Galeri</w:t>
+      </w:r>
+      <w:proofErr w:type="spellEnd"/>
+      <w:r>
+        <w:t xml:space="preserve"> </w:t>
+      </w:r>
+      <w:proofErr w:type="spellStart"/>
+      <w:r>
+        <w:t>Wisata</w:t>
+      </w:r>
+      <w:proofErr w:type="spellEnd"/>
     </w:p>
     <w:p>
       <w:pPr>
@@ -567,11 +1355,145 @@
           <w:rFonts w:ascii="Times New Roman" w:hAnsi="Times New Roman" w:cs="Times New Roman"/>
         </w:rPr>
       </w:pPr>
-      <w:r>
-        <w:rPr>
-          <w:rFonts w:ascii="Times New Roman" w:hAnsi="Times New Roman" w:cs="Times New Roman"/>
-        </w:rPr>
-        <w:t xml:space="preserve">Berhasil menampilkan galeri foto wisata pada halaman utama pengguna dengan integrasi </w:t>
+      <w:proofErr w:type="spellStart"/>
+      <w:r>
+        <w:rPr>
+          <w:rFonts w:ascii="Times New Roman" w:hAnsi="Times New Roman" w:cs="Times New Roman"/>
+        </w:rPr>
+        <w:t>Berhasil</w:t>
+      </w:r>
+      <w:proofErr w:type="spellEnd"/>
+      <w:r>
+        <w:rPr>
+          <w:rFonts w:ascii="Times New Roman" w:hAnsi="Times New Roman" w:cs="Times New Roman"/>
+        </w:rPr>
+        <w:t xml:space="preserve"> </w:t>
+      </w:r>
+      <w:proofErr w:type="spellStart"/>
+      <w:r>
+        <w:rPr>
+          <w:rFonts w:ascii="Times New Roman" w:hAnsi="Times New Roman" w:cs="Times New Roman"/>
+        </w:rPr>
+        <w:t>menampilkan</w:t>
+      </w:r>
+      <w:proofErr w:type="spellEnd"/>
+      <w:r>
+        <w:rPr>
+          <w:rFonts w:ascii="Times New Roman" w:hAnsi="Times New Roman" w:cs="Times New Roman"/>
+        </w:rPr>
+        <w:t xml:space="preserve"> </w:t>
+      </w:r>
+      <w:proofErr w:type="spellStart"/>
+      <w:r>
+        <w:rPr>
+          <w:rFonts w:ascii="Times New Roman" w:hAnsi="Times New Roman" w:cs="Times New Roman"/>
+        </w:rPr>
+        <w:t>galeri</w:t>
+      </w:r>
+      <w:proofErr w:type="spellEnd"/>
+      <w:r>
+        <w:rPr>
+          <w:rFonts w:ascii="Times New Roman" w:hAnsi="Times New Roman" w:cs="Times New Roman"/>
+        </w:rPr>
+        <w:t xml:space="preserve"> </w:t>
+      </w:r>
+      <w:proofErr w:type="spellStart"/>
+      <w:r>
+        <w:rPr>
+          <w:rFonts w:ascii="Times New Roman" w:hAnsi="Times New Roman" w:cs="Times New Roman"/>
+        </w:rPr>
+        <w:t>foto</w:t>
+      </w:r>
+      <w:proofErr w:type="spellEnd"/>
+      <w:r>
+        <w:rPr>
+          <w:rFonts w:ascii="Times New Roman" w:hAnsi="Times New Roman" w:cs="Times New Roman"/>
+        </w:rPr>
+        <w:t xml:space="preserve"> </w:t>
+      </w:r>
+      <w:proofErr w:type="spellStart"/>
+      <w:r>
+        <w:rPr>
+          <w:rFonts w:ascii="Times New Roman" w:hAnsi="Times New Roman" w:cs="Times New Roman"/>
+        </w:rPr>
+        <w:t>wisata</w:t>
+      </w:r>
+      <w:proofErr w:type="spellEnd"/>
+      <w:r>
+        <w:rPr>
+          <w:rFonts w:ascii="Times New Roman" w:hAnsi="Times New Roman" w:cs="Times New Roman"/>
+        </w:rPr>
+        <w:t xml:space="preserve"> pada </w:t>
+      </w:r>
+      <w:proofErr w:type="spellStart"/>
+      <w:r>
+        <w:rPr>
+          <w:rFonts w:ascii="Times New Roman" w:hAnsi="Times New Roman" w:cs="Times New Roman"/>
+        </w:rPr>
+        <w:t>halaman</w:t>
+      </w:r>
+      <w:proofErr w:type="spellEnd"/>
+      <w:r>
+        <w:rPr>
+          <w:rFonts w:ascii="Times New Roman" w:hAnsi="Times New Roman" w:cs="Times New Roman"/>
+        </w:rPr>
+        <w:t xml:space="preserve"> </w:t>
+      </w:r>
+      <w:proofErr w:type="spellStart"/>
+      <w:r>
+        <w:rPr>
+          <w:rFonts w:ascii="Times New Roman" w:hAnsi="Times New Roman" w:cs="Times New Roman"/>
+        </w:rPr>
+        <w:t>utama</w:t>
+      </w:r>
+      <w:proofErr w:type="spellEnd"/>
+      <w:r>
+        <w:rPr>
+          <w:rFonts w:ascii="Times New Roman" w:hAnsi="Times New Roman" w:cs="Times New Roman"/>
+        </w:rPr>
+        <w:t xml:space="preserve"> </w:t>
+      </w:r>
+      <w:proofErr w:type="spellStart"/>
+      <w:r>
+        <w:rPr>
+          <w:rFonts w:ascii="Times New Roman" w:hAnsi="Times New Roman" w:cs="Times New Roman"/>
+        </w:rPr>
+        <w:t>pengguna</w:t>
+      </w:r>
+      <w:proofErr w:type="spellEnd"/>
+      <w:r>
+        <w:rPr>
+          <w:rFonts w:ascii="Times New Roman" w:hAnsi="Times New Roman" w:cs="Times New Roman"/>
+        </w:rPr>
+        <w:t xml:space="preserve"> </w:t>
+      </w:r>
+      <w:proofErr w:type="spellStart"/>
+      <w:r>
+        <w:rPr>
+          <w:rFonts w:ascii="Times New Roman" w:hAnsi="Times New Roman" w:cs="Times New Roman"/>
+        </w:rPr>
+        <w:t>dengan</w:t>
+      </w:r>
+      <w:proofErr w:type="spellEnd"/>
+      <w:r>
+        <w:rPr>
+          <w:rFonts w:ascii="Times New Roman" w:hAnsi="Times New Roman" w:cs="Times New Roman"/>
+        </w:rPr>
+        <w:t xml:space="preserve"> </w:t>
+      </w:r>
+      <w:proofErr w:type="spellStart"/>
+      <w:r>
+        <w:rPr>
+          <w:rFonts w:ascii="Times New Roman" w:hAnsi="Times New Roman" w:cs="Times New Roman"/>
+        </w:rPr>
+        <w:t>integrasi</w:t>
+      </w:r>
+      <w:proofErr w:type="spellEnd"/>
+      <w:r>
+        <w:rPr>
+          <w:rFonts w:ascii="Times New Roman" w:hAnsi="Times New Roman" w:cs="Times New Roman"/>
+        </w:rPr>
+        <w:t xml:space="preserve"> </w:t>
       </w:r>
       <w:r>
         <w:rPr>
@@ -585,7 +1507,245 @@
         <w:rPr>
           <w:rFonts w:ascii="Times New Roman" w:hAnsi="Times New Roman" w:cs="Times New Roman"/>
         </w:rPr>
-        <w:t xml:space="preserve"> detail yang dinamis. Visualisasi kartu wisata kini dilengkapi dengan elemen gambar yang responsif dan terformat secara proporsional untuk kenyamanan antarmuka pengguna.</w:t>
+        <w:t xml:space="preserve"> detail yang </w:t>
+      </w:r>
+      <w:proofErr w:type="spellStart"/>
+      <w:r>
+        <w:rPr>
+          <w:rFonts w:ascii="Times New Roman" w:hAnsi="Times New Roman" w:cs="Times New Roman"/>
+        </w:rPr>
+        <w:t>dinamis</w:t>
+      </w:r>
+      <w:proofErr w:type="spellEnd"/>
+      <w:r>
+        <w:rPr>
+          <w:rFonts w:ascii="Times New Roman" w:hAnsi="Times New Roman" w:cs="Times New Roman"/>
+        </w:rPr>
+        <w:t xml:space="preserve">. </w:t>
+      </w:r>
+      <w:proofErr w:type="spellStart"/>
+      <w:r>
+        <w:rPr>
+          <w:rFonts w:ascii="Times New Roman" w:hAnsi="Times New Roman" w:cs="Times New Roman"/>
+        </w:rPr>
+        <w:t>Visualisasi</w:t>
+      </w:r>
+      <w:proofErr w:type="spellEnd"/>
+      <w:r>
+        <w:rPr>
+          <w:rFonts w:ascii="Times New Roman" w:hAnsi="Times New Roman" w:cs="Times New Roman"/>
+        </w:rPr>
+        <w:t xml:space="preserve"> </w:t>
+      </w:r>
+      <w:proofErr w:type="spellStart"/>
+      <w:r>
+        <w:rPr>
+          <w:rFonts w:ascii="Times New Roman" w:hAnsi="Times New Roman" w:cs="Times New Roman"/>
+        </w:rPr>
+        <w:t>kartu</w:t>
+      </w:r>
+      <w:proofErr w:type="spellEnd"/>
+      <w:r>
+        <w:rPr>
+          <w:rFonts w:ascii="Times New Roman" w:hAnsi="Times New Roman" w:cs="Times New Roman"/>
+        </w:rPr>
+        <w:t xml:space="preserve"> </w:t>
+      </w:r>
+      <w:proofErr w:type="spellStart"/>
+      <w:r>
+        <w:rPr>
+          <w:rFonts w:ascii="Times New Roman" w:hAnsi="Times New Roman" w:cs="Times New Roman"/>
+        </w:rPr>
+        <w:t>wisata</w:t>
+      </w:r>
+      <w:proofErr w:type="spellEnd"/>
+      <w:r>
+        <w:rPr>
+          <w:rFonts w:ascii="Times New Roman" w:hAnsi="Times New Roman" w:cs="Times New Roman"/>
+        </w:rPr>
+        <w:t xml:space="preserve"> </w:t>
+      </w:r>
+      <w:proofErr w:type="spellStart"/>
+      <w:r>
+        <w:rPr>
+          <w:rFonts w:ascii="Times New Roman" w:hAnsi="Times New Roman" w:cs="Times New Roman"/>
+        </w:rPr>
+        <w:t>kini</w:t>
+      </w:r>
+      <w:proofErr w:type="spellEnd"/>
+      <w:r>
+        <w:rPr>
+          <w:rFonts w:ascii="Times New Roman" w:hAnsi="Times New Roman" w:cs="Times New Roman"/>
+        </w:rPr>
+        <w:t xml:space="preserve"> </w:t>
+      </w:r>
+      <w:proofErr w:type="spellStart"/>
+      <w:r>
+        <w:rPr>
+          <w:rFonts w:ascii="Times New Roman" w:hAnsi="Times New Roman" w:cs="Times New Roman"/>
+        </w:rPr>
+        <w:t>dilengkapi</w:t>
+      </w:r>
+      <w:proofErr w:type="spellEnd"/>
+      <w:r>
+        <w:rPr>
+          <w:rFonts w:ascii="Times New Roman" w:hAnsi="Times New Roman" w:cs="Times New Roman"/>
+        </w:rPr>
+        <w:t xml:space="preserve"> </w:t>
+      </w:r>
+      <w:proofErr w:type="spellStart"/>
+      <w:r>
+        <w:rPr>
+          <w:rFonts w:ascii="Times New Roman" w:hAnsi="Times New Roman" w:cs="Times New Roman"/>
+        </w:rPr>
+        <w:t>dengan</w:t>
+      </w:r>
+      <w:proofErr w:type="spellEnd"/>
+      <w:r>
+        <w:rPr>
+          <w:rFonts w:ascii="Times New Roman" w:hAnsi="Times New Roman" w:cs="Times New Roman"/>
+        </w:rPr>
+        <w:t xml:space="preserve"> </w:t>
+      </w:r>
+      <w:proofErr w:type="spellStart"/>
+      <w:r>
+        <w:rPr>
+          <w:rFonts w:ascii="Times New Roman" w:hAnsi="Times New Roman" w:cs="Times New Roman"/>
+        </w:rPr>
+        <w:t>elemen</w:t>
+      </w:r>
+      <w:proofErr w:type="spellEnd"/>
+      <w:r>
+        <w:rPr>
+          <w:rFonts w:ascii="Times New Roman" w:hAnsi="Times New Roman" w:cs="Times New Roman"/>
+        </w:rPr>
+        <w:t xml:space="preserve"> </w:t>
+      </w:r>
+      <w:proofErr w:type="spellStart"/>
+      <w:r>
+        <w:rPr>
+          <w:rFonts w:ascii="Times New Roman" w:hAnsi="Times New Roman" w:cs="Times New Roman"/>
+        </w:rPr>
+        <w:t>gambar</w:t>
+      </w:r>
+      <w:proofErr w:type="spellEnd"/>
+      <w:r>
+        <w:rPr>
+          <w:rFonts w:ascii="Times New Roman" w:hAnsi="Times New Roman" w:cs="Times New Roman"/>
+        </w:rPr>
+        <w:t xml:space="preserve"> yang </w:t>
+      </w:r>
+      <w:proofErr w:type="spellStart"/>
+      <w:r>
+        <w:rPr>
+          <w:rFonts w:ascii="Times New Roman" w:hAnsi="Times New Roman" w:cs="Times New Roman"/>
+        </w:rPr>
+        <w:t>responsif</w:t>
+      </w:r>
+      <w:proofErr w:type="spellEnd"/>
+      <w:r>
+        <w:rPr>
+          <w:rFonts w:ascii="Times New Roman" w:hAnsi="Times New Roman" w:cs="Times New Roman"/>
+        </w:rPr>
+        <w:t xml:space="preserve"> dan </w:t>
+      </w:r>
+      <w:proofErr w:type="spellStart"/>
+      <w:r>
+        <w:rPr>
+          <w:rFonts w:ascii="Times New Roman" w:hAnsi="Times New Roman" w:cs="Times New Roman"/>
+        </w:rPr>
+        <w:t>terformat</w:t>
+      </w:r>
+      <w:proofErr w:type="spellEnd"/>
+      <w:r>
+        <w:rPr>
+          <w:rFonts w:ascii="Times New Roman" w:hAnsi="Times New Roman" w:cs="Times New Roman"/>
+        </w:rPr>
+        <w:t xml:space="preserve"> </w:t>
+      </w:r>
+      <w:proofErr w:type="spellStart"/>
+      <w:r>
+        <w:rPr>
+          <w:rFonts w:ascii="Times New Roman" w:hAnsi="Times New Roman" w:cs="Times New Roman"/>
+        </w:rPr>
+        <w:t>secara</w:t>
+      </w:r>
+      <w:proofErr w:type="spellEnd"/>
+      <w:r>
+        <w:rPr>
+          <w:rFonts w:ascii="Times New Roman" w:hAnsi="Times New Roman" w:cs="Times New Roman"/>
+        </w:rPr>
+        <w:t xml:space="preserve"> </w:t>
+      </w:r>
+      <w:proofErr w:type="spellStart"/>
+      <w:r>
+        <w:rPr>
+          <w:rFonts w:ascii="Times New Roman" w:hAnsi="Times New Roman" w:cs="Times New Roman"/>
+        </w:rPr>
+        <w:t>proporsional</w:t>
+      </w:r>
+      <w:proofErr w:type="spellEnd"/>
+      <w:r>
+        <w:rPr>
+          <w:rFonts w:ascii="Times New Roman" w:hAnsi="Times New Roman" w:cs="Times New Roman"/>
+        </w:rPr>
+        <w:t xml:space="preserve"> </w:t>
+      </w:r>
+      <w:proofErr w:type="spellStart"/>
+      <w:r>
+        <w:rPr>
+          <w:rFonts w:ascii="Times New Roman" w:hAnsi="Times New Roman" w:cs="Times New Roman"/>
+        </w:rPr>
+        <w:t>untuk</w:t>
+      </w:r>
+      <w:proofErr w:type="spellEnd"/>
+      <w:r>
+        <w:rPr>
+          <w:rFonts w:ascii="Times New Roman" w:hAnsi="Times New Roman" w:cs="Times New Roman"/>
+        </w:rPr>
+        <w:t xml:space="preserve"> </w:t>
+      </w:r>
+      <w:proofErr w:type="spellStart"/>
+      <w:r>
+        <w:rPr>
+          <w:rFonts w:ascii="Times New Roman" w:hAnsi="Times New Roman" w:cs="Times New Roman"/>
+        </w:rPr>
+        <w:t>kenyamanan</w:t>
+      </w:r>
+      <w:proofErr w:type="spellEnd"/>
+      <w:r>
+        <w:rPr>
+          <w:rFonts w:ascii="Times New Roman" w:hAnsi="Times New Roman" w:cs="Times New Roman"/>
+        </w:rPr>
+        <w:t xml:space="preserve"> </w:t>
+      </w:r>
+      <w:proofErr w:type="spellStart"/>
+      <w:r>
+        <w:rPr>
+          <w:rFonts w:ascii="Times New Roman" w:hAnsi="Times New Roman" w:cs="Times New Roman"/>
+        </w:rPr>
+        <w:t>antarmuka</w:t>
+      </w:r>
+      <w:proofErr w:type="spellEnd"/>
+      <w:r>
+        <w:rPr>
+          <w:rFonts w:ascii="Times New Roman" w:hAnsi="Times New Roman" w:cs="Times New Roman"/>
+        </w:rPr>
+        <w:t xml:space="preserve"> </w:t>
+      </w:r>
+      <w:proofErr w:type="spellStart"/>
+      <w:r>
+        <w:rPr>
+          <w:rFonts w:ascii="Times New Roman" w:hAnsi="Times New Roman" w:cs="Times New Roman"/>
+        </w:rPr>
+        <w:t>pengguna</w:t>
+      </w:r>
+      <w:proofErr w:type="spellEnd"/>
+      <w:r>
+        <w:rPr>
+          <w:rFonts w:ascii="Times New Roman" w:hAnsi="Times New Roman" w:cs="Times New Roman"/>
+        </w:rPr>
+        <w:t>.</w:t>
       </w:r>
     </w:p>
     <w:p>
@@ -609,11 +1769,33 @@
           <w:rFonts w:ascii="Times New Roman" w:hAnsi="Times New Roman" w:cs="Times New Roman"/>
         </w:rPr>
       </w:pPr>
-      <w:r>
-        <w:rPr>
-          <w:rFonts w:ascii="Times New Roman" w:hAnsi="Times New Roman" w:cs="Times New Roman"/>
-        </w:rPr>
-        <w:t>Perbaikan Endpoint Tiket dan Proses Checkout</w:t>
+      <w:proofErr w:type="spellStart"/>
+      <w:r>
+        <w:rPr>
+          <w:rFonts w:ascii="Times New Roman" w:hAnsi="Times New Roman" w:cs="Times New Roman"/>
+        </w:rPr>
+        <w:t>Perbaikan</w:t>
+      </w:r>
+      <w:proofErr w:type="spellEnd"/>
+      <w:r>
+        <w:rPr>
+          <w:rFonts w:ascii="Times New Roman" w:hAnsi="Times New Roman" w:cs="Times New Roman"/>
+        </w:rPr>
+        <w:t xml:space="preserve"> Endpoint </w:t>
+      </w:r>
+      <w:proofErr w:type="spellStart"/>
+      <w:r>
+        <w:rPr>
+          <w:rFonts w:ascii="Times New Roman" w:hAnsi="Times New Roman" w:cs="Times New Roman"/>
+        </w:rPr>
+        <w:t>Tiket</w:t>
+      </w:r>
+      <w:proofErr w:type="spellEnd"/>
+      <w:r>
+        <w:rPr>
+          <w:rFonts w:ascii="Times New Roman" w:hAnsi="Times New Roman" w:cs="Times New Roman"/>
+        </w:rPr>
+        <w:t xml:space="preserve"> dan Proses Checkout</w:t>
       </w:r>
     </w:p>
     <w:p>
@@ -627,6 +1809,7 @@
       <w:r>
         <w:rPr>
           <w:rFonts w:ascii="Times New Roman" w:hAnsi="Times New Roman" w:cs="Times New Roman"/>
+          <w:noProof/>
         </w:rPr>
         <w:drawing>
           <wp:inline distT="0" distB="0" distL="0" distR="0" wp14:anchorId="517588D3" wp14:editId="07C9006A">
@@ -673,18 +1856,1352 @@
           <w:rFonts w:ascii="Times New Roman" w:hAnsi="Times New Roman" w:cs="Times New Roman"/>
         </w:rPr>
       </w:pPr>
-      <w:r>
-        <w:rPr>
-          <w:rFonts w:ascii="Times New Roman" w:hAnsi="Times New Roman" w:cs="Times New Roman"/>
-        </w:rPr>
-        <w:t xml:space="preserve">Berhasil melakukan debugging dan sinkronisasi data pada fitur pemesanan tiket wisata. Sistem checkout telah diperbaiki dengan validasi data yang lebih baik, konversi tipe data numerik yang konsisten, serta penanganan relasi data wisata pada backend. Selain itu, konflik kode hasil integrasi Git berhasil diselesaikan sehingga proses pembuatan tiket, penyimpanan data booking, dan pengiriman informasi dari frontend ke backend dapat </w:t>
-      </w:r>
+      <w:proofErr w:type="spellStart"/>
+      <w:r>
+        <w:rPr>
+          <w:rFonts w:ascii="Times New Roman" w:hAnsi="Times New Roman" w:cs="Times New Roman"/>
+        </w:rPr>
+        <w:t>Berhasil</w:t>
+      </w:r>
+      <w:proofErr w:type="spellEnd"/>
+      <w:r>
+        <w:rPr>
+          <w:rFonts w:ascii="Times New Roman" w:hAnsi="Times New Roman" w:cs="Times New Roman"/>
+        </w:rPr>
+        <w:t xml:space="preserve"> </w:t>
+      </w:r>
+      <w:proofErr w:type="spellStart"/>
+      <w:r>
+        <w:rPr>
+          <w:rFonts w:ascii="Times New Roman" w:hAnsi="Times New Roman" w:cs="Times New Roman"/>
+        </w:rPr>
+        <w:t>melakukan</w:t>
+      </w:r>
+      <w:proofErr w:type="spellEnd"/>
+      <w:r>
+        <w:rPr>
+          <w:rFonts w:ascii="Times New Roman" w:hAnsi="Times New Roman" w:cs="Times New Roman"/>
+        </w:rPr>
+        <w:t xml:space="preserve"> debugging dan </w:t>
+      </w:r>
+      <w:proofErr w:type="spellStart"/>
+      <w:r>
+        <w:rPr>
+          <w:rFonts w:ascii="Times New Roman" w:hAnsi="Times New Roman" w:cs="Times New Roman"/>
+        </w:rPr>
+        <w:t>sinkronisasi</w:t>
+      </w:r>
+      <w:proofErr w:type="spellEnd"/>
+      <w:r>
+        <w:rPr>
+          <w:rFonts w:ascii="Times New Roman" w:hAnsi="Times New Roman" w:cs="Times New Roman"/>
+        </w:rPr>
+        <w:t xml:space="preserve"> data pada </w:t>
+      </w:r>
+      <w:proofErr w:type="spellStart"/>
+      <w:r>
+        <w:rPr>
+          <w:rFonts w:ascii="Times New Roman" w:hAnsi="Times New Roman" w:cs="Times New Roman"/>
+        </w:rPr>
+        <w:t>fitur</w:t>
+      </w:r>
+      <w:proofErr w:type="spellEnd"/>
+      <w:r>
+        <w:rPr>
+          <w:rFonts w:ascii="Times New Roman" w:hAnsi="Times New Roman" w:cs="Times New Roman"/>
+        </w:rPr>
+        <w:t xml:space="preserve"> </w:t>
+      </w:r>
+      <w:proofErr w:type="spellStart"/>
+      <w:r>
+        <w:rPr>
+          <w:rFonts w:ascii="Times New Roman" w:hAnsi="Times New Roman" w:cs="Times New Roman"/>
+        </w:rPr>
+        <w:t>pemesanan</w:t>
+      </w:r>
+      <w:proofErr w:type="spellEnd"/>
+      <w:r>
+        <w:rPr>
+          <w:rFonts w:ascii="Times New Roman" w:hAnsi="Times New Roman" w:cs="Times New Roman"/>
+        </w:rPr>
+        <w:t xml:space="preserve"> </w:t>
+      </w:r>
+      <w:proofErr w:type="spellStart"/>
+      <w:r>
+        <w:rPr>
+          <w:rFonts w:ascii="Times New Roman" w:hAnsi="Times New Roman" w:cs="Times New Roman"/>
+        </w:rPr>
+        <w:t>tiket</w:t>
+      </w:r>
+      <w:proofErr w:type="spellEnd"/>
+      <w:r>
+        <w:rPr>
+          <w:rFonts w:ascii="Times New Roman" w:hAnsi="Times New Roman" w:cs="Times New Roman"/>
+        </w:rPr>
+        <w:t xml:space="preserve"> </w:t>
+      </w:r>
+      <w:proofErr w:type="spellStart"/>
+      <w:r>
+        <w:rPr>
+          <w:rFonts w:ascii="Times New Roman" w:hAnsi="Times New Roman" w:cs="Times New Roman"/>
+        </w:rPr>
+        <w:t>wisata</w:t>
+      </w:r>
+      <w:proofErr w:type="spellEnd"/>
+      <w:r>
+        <w:rPr>
+          <w:rFonts w:ascii="Times New Roman" w:hAnsi="Times New Roman" w:cs="Times New Roman"/>
+        </w:rPr>
+        <w:t xml:space="preserve">. </w:t>
+      </w:r>
+      <w:proofErr w:type="spellStart"/>
+      <w:r>
+        <w:rPr>
+          <w:rFonts w:ascii="Times New Roman" w:hAnsi="Times New Roman" w:cs="Times New Roman"/>
+        </w:rPr>
+        <w:t>Sistem</w:t>
+      </w:r>
+      <w:proofErr w:type="spellEnd"/>
+      <w:r>
+        <w:rPr>
+          <w:rFonts w:ascii="Times New Roman" w:hAnsi="Times New Roman" w:cs="Times New Roman"/>
+        </w:rPr>
+        <w:t xml:space="preserve"> checkout </w:t>
+      </w:r>
+      <w:proofErr w:type="spellStart"/>
+      <w:r>
+        <w:rPr>
+          <w:rFonts w:ascii="Times New Roman" w:hAnsi="Times New Roman" w:cs="Times New Roman"/>
+        </w:rPr>
+        <w:t>telah</w:t>
+      </w:r>
+      <w:proofErr w:type="spellEnd"/>
+      <w:r>
+        <w:rPr>
+          <w:rFonts w:ascii="Times New Roman" w:hAnsi="Times New Roman" w:cs="Times New Roman"/>
+        </w:rPr>
+        <w:t xml:space="preserve"> </w:t>
+      </w:r>
+      <w:proofErr w:type="spellStart"/>
+      <w:r>
+        <w:rPr>
+          <w:rFonts w:ascii="Times New Roman" w:hAnsi="Times New Roman" w:cs="Times New Roman"/>
+        </w:rPr>
+        <w:t>diperbaiki</w:t>
+      </w:r>
+      <w:proofErr w:type="spellEnd"/>
+      <w:r>
+        <w:rPr>
+          <w:rFonts w:ascii="Times New Roman" w:hAnsi="Times New Roman" w:cs="Times New Roman"/>
+        </w:rPr>
+        <w:t xml:space="preserve"> </w:t>
+      </w:r>
+      <w:proofErr w:type="spellStart"/>
+      <w:r>
+        <w:rPr>
+          <w:rFonts w:ascii="Times New Roman" w:hAnsi="Times New Roman" w:cs="Times New Roman"/>
+        </w:rPr>
+        <w:t>dengan</w:t>
+      </w:r>
+      <w:proofErr w:type="spellEnd"/>
+      <w:r>
+        <w:rPr>
+          <w:rFonts w:ascii="Times New Roman" w:hAnsi="Times New Roman" w:cs="Times New Roman"/>
+        </w:rPr>
+        <w:t xml:space="preserve"> </w:t>
+      </w:r>
+      <w:proofErr w:type="spellStart"/>
+      <w:r>
+        <w:rPr>
+          <w:rFonts w:ascii="Times New Roman" w:hAnsi="Times New Roman" w:cs="Times New Roman"/>
+        </w:rPr>
+        <w:t>validasi</w:t>
+      </w:r>
+      <w:proofErr w:type="spellEnd"/>
+      <w:r>
+        <w:rPr>
+          <w:rFonts w:ascii="Times New Roman" w:hAnsi="Times New Roman" w:cs="Times New Roman"/>
+        </w:rPr>
+        <w:t xml:space="preserve"> data yang </w:t>
+      </w:r>
+      <w:proofErr w:type="spellStart"/>
+      <w:r>
+        <w:rPr>
+          <w:rFonts w:ascii="Times New Roman" w:hAnsi="Times New Roman" w:cs="Times New Roman"/>
+        </w:rPr>
+        <w:t>lebih</w:t>
+      </w:r>
+      <w:proofErr w:type="spellEnd"/>
+      <w:r>
+        <w:rPr>
+          <w:rFonts w:ascii="Times New Roman" w:hAnsi="Times New Roman" w:cs="Times New Roman"/>
+        </w:rPr>
+        <w:t xml:space="preserve"> </w:t>
+      </w:r>
+      <w:proofErr w:type="spellStart"/>
+      <w:r>
+        <w:rPr>
+          <w:rFonts w:ascii="Times New Roman" w:hAnsi="Times New Roman" w:cs="Times New Roman"/>
+        </w:rPr>
+        <w:t>baik</w:t>
+      </w:r>
+      <w:proofErr w:type="spellEnd"/>
+      <w:r>
+        <w:rPr>
+          <w:rFonts w:ascii="Times New Roman" w:hAnsi="Times New Roman" w:cs="Times New Roman"/>
+        </w:rPr>
+        <w:t xml:space="preserve">, </w:t>
+      </w:r>
+      <w:proofErr w:type="spellStart"/>
+      <w:r>
+        <w:rPr>
+          <w:rFonts w:ascii="Times New Roman" w:hAnsi="Times New Roman" w:cs="Times New Roman"/>
+        </w:rPr>
+        <w:t>konversi</w:t>
+      </w:r>
+      <w:proofErr w:type="spellEnd"/>
+      <w:r>
+        <w:rPr>
+          <w:rFonts w:ascii="Times New Roman" w:hAnsi="Times New Roman" w:cs="Times New Roman"/>
+        </w:rPr>
+        <w:t xml:space="preserve"> </w:t>
+      </w:r>
+      <w:proofErr w:type="spellStart"/>
+      <w:r>
+        <w:rPr>
+          <w:rFonts w:ascii="Times New Roman" w:hAnsi="Times New Roman" w:cs="Times New Roman"/>
+        </w:rPr>
+        <w:t>tipe</w:t>
+      </w:r>
+      <w:proofErr w:type="spellEnd"/>
+      <w:r>
+        <w:rPr>
+          <w:rFonts w:ascii="Times New Roman" w:hAnsi="Times New Roman" w:cs="Times New Roman"/>
+        </w:rPr>
+        <w:t xml:space="preserve"> data </w:t>
+      </w:r>
+      <w:proofErr w:type="spellStart"/>
+      <w:r>
+        <w:rPr>
+          <w:rFonts w:ascii="Times New Roman" w:hAnsi="Times New Roman" w:cs="Times New Roman"/>
+        </w:rPr>
+        <w:t>numerik</w:t>
+      </w:r>
+      <w:proofErr w:type="spellEnd"/>
+      <w:r>
+        <w:rPr>
+          <w:rFonts w:ascii="Times New Roman" w:hAnsi="Times New Roman" w:cs="Times New Roman"/>
+        </w:rPr>
+        <w:t xml:space="preserve"> yang </w:t>
+      </w:r>
+      <w:proofErr w:type="spellStart"/>
+      <w:r>
+        <w:rPr>
+          <w:rFonts w:ascii="Times New Roman" w:hAnsi="Times New Roman" w:cs="Times New Roman"/>
+        </w:rPr>
+        <w:t>konsisten</w:t>
+      </w:r>
+      <w:proofErr w:type="spellEnd"/>
+      <w:r>
+        <w:rPr>
+          <w:rFonts w:ascii="Times New Roman" w:hAnsi="Times New Roman" w:cs="Times New Roman"/>
+        </w:rPr>
+        <w:t xml:space="preserve">, </w:t>
+      </w:r>
+      <w:proofErr w:type="spellStart"/>
+      <w:r>
+        <w:rPr>
+          <w:rFonts w:ascii="Times New Roman" w:hAnsi="Times New Roman" w:cs="Times New Roman"/>
+        </w:rPr>
+        <w:t>serta</w:t>
+      </w:r>
+      <w:proofErr w:type="spellEnd"/>
+      <w:r>
+        <w:rPr>
+          <w:rFonts w:ascii="Times New Roman" w:hAnsi="Times New Roman" w:cs="Times New Roman"/>
+        </w:rPr>
+        <w:t xml:space="preserve"> </w:t>
+      </w:r>
+      <w:proofErr w:type="spellStart"/>
+      <w:r>
+        <w:rPr>
+          <w:rFonts w:ascii="Times New Roman" w:hAnsi="Times New Roman" w:cs="Times New Roman"/>
+        </w:rPr>
+        <w:t>penanganan</w:t>
+      </w:r>
+      <w:proofErr w:type="spellEnd"/>
+      <w:r>
+        <w:rPr>
+          <w:rFonts w:ascii="Times New Roman" w:hAnsi="Times New Roman" w:cs="Times New Roman"/>
+        </w:rPr>
+        <w:t xml:space="preserve"> </w:t>
+      </w:r>
+      <w:proofErr w:type="spellStart"/>
+      <w:r>
+        <w:rPr>
+          <w:rFonts w:ascii="Times New Roman" w:hAnsi="Times New Roman" w:cs="Times New Roman"/>
+        </w:rPr>
+        <w:t>relasi</w:t>
+      </w:r>
+      <w:proofErr w:type="spellEnd"/>
+      <w:r>
+        <w:rPr>
+          <w:rFonts w:ascii="Times New Roman" w:hAnsi="Times New Roman" w:cs="Times New Roman"/>
+        </w:rPr>
+        <w:t xml:space="preserve"> data </w:t>
+      </w:r>
+      <w:proofErr w:type="spellStart"/>
+      <w:r>
+        <w:rPr>
+          <w:rFonts w:ascii="Times New Roman" w:hAnsi="Times New Roman" w:cs="Times New Roman"/>
+        </w:rPr>
+        <w:t>wisata</w:t>
+      </w:r>
+      <w:proofErr w:type="spellEnd"/>
+      <w:r>
+        <w:rPr>
+          <w:rFonts w:ascii="Times New Roman" w:hAnsi="Times New Roman" w:cs="Times New Roman"/>
+        </w:rPr>
+        <w:t xml:space="preserve"> pada backend. Selain </w:t>
+      </w:r>
+      <w:proofErr w:type="spellStart"/>
+      <w:r>
+        <w:rPr>
+          <w:rFonts w:ascii="Times New Roman" w:hAnsi="Times New Roman" w:cs="Times New Roman"/>
+        </w:rPr>
+        <w:t>itu</w:t>
+      </w:r>
+      <w:proofErr w:type="spellEnd"/>
+      <w:r>
+        <w:rPr>
+          <w:rFonts w:ascii="Times New Roman" w:hAnsi="Times New Roman" w:cs="Times New Roman"/>
+        </w:rPr>
+        <w:t xml:space="preserve">, </w:t>
+      </w:r>
+      <w:proofErr w:type="spellStart"/>
+      <w:r>
+        <w:rPr>
+          <w:rFonts w:ascii="Times New Roman" w:hAnsi="Times New Roman" w:cs="Times New Roman"/>
+        </w:rPr>
+        <w:t>konflik</w:t>
+      </w:r>
+      <w:proofErr w:type="spellEnd"/>
+      <w:r>
+        <w:rPr>
+          <w:rFonts w:ascii="Times New Roman" w:hAnsi="Times New Roman" w:cs="Times New Roman"/>
+        </w:rPr>
+        <w:t xml:space="preserve"> </w:t>
+      </w:r>
+      <w:proofErr w:type="spellStart"/>
+      <w:r>
+        <w:rPr>
+          <w:rFonts w:ascii="Times New Roman" w:hAnsi="Times New Roman" w:cs="Times New Roman"/>
+        </w:rPr>
+        <w:t>kode</w:t>
+      </w:r>
+      <w:proofErr w:type="spellEnd"/>
+      <w:r>
+        <w:rPr>
+          <w:rFonts w:ascii="Times New Roman" w:hAnsi="Times New Roman" w:cs="Times New Roman"/>
+        </w:rPr>
+        <w:t xml:space="preserve"> </w:t>
+      </w:r>
+      <w:proofErr w:type="spellStart"/>
+      <w:r>
+        <w:rPr>
+          <w:rFonts w:ascii="Times New Roman" w:hAnsi="Times New Roman" w:cs="Times New Roman"/>
+        </w:rPr>
+        <w:t>hasil</w:t>
+      </w:r>
+      <w:proofErr w:type="spellEnd"/>
+      <w:r>
+        <w:rPr>
+          <w:rFonts w:ascii="Times New Roman" w:hAnsi="Times New Roman" w:cs="Times New Roman"/>
+        </w:rPr>
+        <w:t xml:space="preserve"> </w:t>
+      </w:r>
+      <w:proofErr w:type="spellStart"/>
+      <w:r>
+        <w:rPr>
+          <w:rFonts w:ascii="Times New Roman" w:hAnsi="Times New Roman" w:cs="Times New Roman"/>
+        </w:rPr>
+        <w:t>integrasi</w:t>
+      </w:r>
+      <w:proofErr w:type="spellEnd"/>
+      <w:r>
+        <w:rPr>
+          <w:rFonts w:ascii="Times New Roman" w:hAnsi="Times New Roman" w:cs="Times New Roman"/>
+        </w:rPr>
+        <w:t xml:space="preserve"> Git </w:t>
+      </w:r>
+      <w:proofErr w:type="spellStart"/>
+      <w:r>
+        <w:rPr>
+          <w:rFonts w:ascii="Times New Roman" w:hAnsi="Times New Roman" w:cs="Times New Roman"/>
+        </w:rPr>
+        <w:t>berhasil</w:t>
+      </w:r>
+      <w:proofErr w:type="spellEnd"/>
+      <w:r>
+        <w:rPr>
+          <w:rFonts w:ascii="Times New Roman" w:hAnsi="Times New Roman" w:cs="Times New Roman"/>
+        </w:rPr>
+        <w:t xml:space="preserve"> </w:t>
+      </w:r>
+      <w:proofErr w:type="spellStart"/>
+      <w:r>
+        <w:rPr>
+          <w:rFonts w:ascii="Times New Roman" w:hAnsi="Times New Roman" w:cs="Times New Roman"/>
+        </w:rPr>
+        <w:t>diselesaikan</w:t>
+      </w:r>
+      <w:proofErr w:type="spellEnd"/>
+      <w:r>
+        <w:rPr>
+          <w:rFonts w:ascii="Times New Roman" w:hAnsi="Times New Roman" w:cs="Times New Roman"/>
+        </w:rPr>
+        <w:t xml:space="preserve"> </w:t>
+      </w:r>
+      <w:proofErr w:type="spellStart"/>
+      <w:r>
+        <w:rPr>
+          <w:rFonts w:ascii="Times New Roman" w:hAnsi="Times New Roman" w:cs="Times New Roman"/>
+        </w:rPr>
+        <w:t>sehingga</w:t>
+      </w:r>
+      <w:proofErr w:type="spellEnd"/>
+      <w:r>
+        <w:rPr>
+          <w:rFonts w:ascii="Times New Roman" w:hAnsi="Times New Roman" w:cs="Times New Roman"/>
+        </w:rPr>
+        <w:t xml:space="preserve"> proses </w:t>
+      </w:r>
+      <w:proofErr w:type="spellStart"/>
+      <w:r>
+        <w:rPr>
+          <w:rFonts w:ascii="Times New Roman" w:hAnsi="Times New Roman" w:cs="Times New Roman"/>
+        </w:rPr>
+        <w:t>pembuatan</w:t>
+      </w:r>
+      <w:proofErr w:type="spellEnd"/>
+      <w:r>
+        <w:rPr>
+          <w:rFonts w:ascii="Times New Roman" w:hAnsi="Times New Roman" w:cs="Times New Roman"/>
+        </w:rPr>
+        <w:t xml:space="preserve"> </w:t>
+      </w:r>
+      <w:proofErr w:type="spellStart"/>
+      <w:r>
+        <w:rPr>
+          <w:rFonts w:ascii="Times New Roman" w:hAnsi="Times New Roman" w:cs="Times New Roman"/>
+        </w:rPr>
+        <w:t>tiket</w:t>
+      </w:r>
+      <w:proofErr w:type="spellEnd"/>
+      <w:r>
+        <w:rPr>
+          <w:rFonts w:ascii="Times New Roman" w:hAnsi="Times New Roman" w:cs="Times New Roman"/>
+        </w:rPr>
+        <w:t xml:space="preserve">, </w:t>
+      </w:r>
+      <w:proofErr w:type="spellStart"/>
+      <w:r>
+        <w:rPr>
+          <w:rFonts w:ascii="Times New Roman" w:hAnsi="Times New Roman" w:cs="Times New Roman"/>
+        </w:rPr>
+        <w:t>penyimpanan</w:t>
+      </w:r>
+      <w:proofErr w:type="spellEnd"/>
+      <w:r>
+        <w:rPr>
+          <w:rFonts w:ascii="Times New Roman" w:hAnsi="Times New Roman" w:cs="Times New Roman"/>
+        </w:rPr>
+        <w:t xml:space="preserve"> data booking, dan </w:t>
+      </w:r>
+      <w:proofErr w:type="spellStart"/>
+      <w:r>
+        <w:rPr>
+          <w:rFonts w:ascii="Times New Roman" w:hAnsi="Times New Roman" w:cs="Times New Roman"/>
+        </w:rPr>
+        <w:t>pengiriman</w:t>
+      </w:r>
+      <w:proofErr w:type="spellEnd"/>
+      <w:r>
+        <w:rPr>
+          <w:rFonts w:ascii="Times New Roman" w:hAnsi="Times New Roman" w:cs="Times New Roman"/>
+        </w:rPr>
+        <w:t xml:space="preserve"> </w:t>
+      </w:r>
+      <w:proofErr w:type="spellStart"/>
+      <w:r>
+        <w:rPr>
+          <w:rFonts w:ascii="Times New Roman" w:hAnsi="Times New Roman" w:cs="Times New Roman"/>
+        </w:rPr>
+        <w:t>informasi</w:t>
+      </w:r>
+      <w:proofErr w:type="spellEnd"/>
+      <w:r>
+        <w:rPr>
+          <w:rFonts w:ascii="Times New Roman" w:hAnsi="Times New Roman" w:cs="Times New Roman"/>
+        </w:rPr>
+        <w:t xml:space="preserve"> </w:t>
+      </w:r>
+      <w:proofErr w:type="spellStart"/>
+      <w:r>
+        <w:rPr>
+          <w:rFonts w:ascii="Times New Roman" w:hAnsi="Times New Roman" w:cs="Times New Roman"/>
+        </w:rPr>
+        <w:t>dari</w:t>
+      </w:r>
+      <w:proofErr w:type="spellEnd"/>
+      <w:r>
+        <w:rPr>
+          <w:rFonts w:ascii="Times New Roman" w:hAnsi="Times New Roman" w:cs="Times New Roman"/>
+        </w:rPr>
+        <w:t xml:space="preserve"> frontend </w:t>
+      </w:r>
+      <w:proofErr w:type="spellStart"/>
+      <w:r>
+        <w:rPr>
+          <w:rFonts w:ascii="Times New Roman" w:hAnsi="Times New Roman" w:cs="Times New Roman"/>
+        </w:rPr>
+        <w:t>ke</w:t>
+      </w:r>
+      <w:proofErr w:type="spellEnd"/>
+      <w:r>
+        <w:rPr>
+          <w:rFonts w:ascii="Times New Roman" w:hAnsi="Times New Roman" w:cs="Times New Roman"/>
+        </w:rPr>
+        <w:t xml:space="preserve"> backend </w:t>
+      </w:r>
+      <w:proofErr w:type="spellStart"/>
+      <w:r>
+        <w:rPr>
+          <w:rFonts w:ascii="Times New Roman" w:hAnsi="Times New Roman" w:cs="Times New Roman"/>
+        </w:rPr>
+        <w:t>dapat</w:t>
+      </w:r>
+      <w:proofErr w:type="spellEnd"/>
+      <w:r>
+        <w:rPr>
+          <w:rFonts w:ascii="Times New Roman" w:hAnsi="Times New Roman" w:cs="Times New Roman"/>
+        </w:rPr>
+        <w:t xml:space="preserve"> </w:t>
+      </w:r>
+      <w:proofErr w:type="spellStart"/>
       <w:r>
         <w:rPr>
           <w:rFonts w:ascii="Times New Roman" w:hAnsi="Times New Roman" w:cs="Times New Roman"/>
         </w:rPr>
         <w:lastRenderedPageBreak/>
-        <w:t>berjalan dengan normal. Fitur checkout kini mampu menghasilkan data tiket secara otomatis dan menampilkan informasi transaksi dengan lebih stabil serta akurat.</w:t>
+        <w:t>berjalan</w:t>
+      </w:r>
+      <w:proofErr w:type="spellEnd"/>
+      <w:r>
+        <w:rPr>
+          <w:rFonts w:ascii="Times New Roman" w:hAnsi="Times New Roman" w:cs="Times New Roman"/>
+        </w:rPr>
+        <w:t xml:space="preserve"> </w:t>
+      </w:r>
+      <w:proofErr w:type="spellStart"/>
+      <w:r>
+        <w:rPr>
+          <w:rFonts w:ascii="Times New Roman" w:hAnsi="Times New Roman" w:cs="Times New Roman"/>
+        </w:rPr>
+        <w:t>dengan</w:t>
+      </w:r>
+      <w:proofErr w:type="spellEnd"/>
+      <w:r>
+        <w:rPr>
+          <w:rFonts w:ascii="Times New Roman" w:hAnsi="Times New Roman" w:cs="Times New Roman"/>
+        </w:rPr>
+        <w:t xml:space="preserve"> normal. Fitur checkout </w:t>
+      </w:r>
+      <w:proofErr w:type="spellStart"/>
+      <w:r>
+        <w:rPr>
+          <w:rFonts w:ascii="Times New Roman" w:hAnsi="Times New Roman" w:cs="Times New Roman"/>
+        </w:rPr>
+        <w:t>kini</w:t>
+      </w:r>
+      <w:proofErr w:type="spellEnd"/>
+      <w:r>
+        <w:rPr>
+          <w:rFonts w:ascii="Times New Roman" w:hAnsi="Times New Roman" w:cs="Times New Roman"/>
+        </w:rPr>
+        <w:t xml:space="preserve"> </w:t>
+      </w:r>
+      <w:proofErr w:type="spellStart"/>
+      <w:r>
+        <w:rPr>
+          <w:rFonts w:ascii="Times New Roman" w:hAnsi="Times New Roman" w:cs="Times New Roman"/>
+        </w:rPr>
+        <w:t>mampu</w:t>
+      </w:r>
+      <w:proofErr w:type="spellEnd"/>
+      <w:r>
+        <w:rPr>
+          <w:rFonts w:ascii="Times New Roman" w:hAnsi="Times New Roman" w:cs="Times New Roman"/>
+        </w:rPr>
+        <w:t xml:space="preserve"> </w:t>
+      </w:r>
+      <w:proofErr w:type="spellStart"/>
+      <w:r>
+        <w:rPr>
+          <w:rFonts w:ascii="Times New Roman" w:hAnsi="Times New Roman" w:cs="Times New Roman"/>
+        </w:rPr>
+        <w:t>menghasilkan</w:t>
+      </w:r>
+      <w:proofErr w:type="spellEnd"/>
+      <w:r>
+        <w:rPr>
+          <w:rFonts w:ascii="Times New Roman" w:hAnsi="Times New Roman" w:cs="Times New Roman"/>
+        </w:rPr>
+        <w:t xml:space="preserve"> data </w:t>
+      </w:r>
+      <w:proofErr w:type="spellStart"/>
+      <w:r>
+        <w:rPr>
+          <w:rFonts w:ascii="Times New Roman" w:hAnsi="Times New Roman" w:cs="Times New Roman"/>
+        </w:rPr>
+        <w:t>tiket</w:t>
+      </w:r>
+      <w:proofErr w:type="spellEnd"/>
+      <w:r>
+        <w:rPr>
+          <w:rFonts w:ascii="Times New Roman" w:hAnsi="Times New Roman" w:cs="Times New Roman"/>
+        </w:rPr>
+        <w:t xml:space="preserve"> </w:t>
+      </w:r>
+      <w:proofErr w:type="spellStart"/>
+      <w:r>
+        <w:rPr>
+          <w:rFonts w:ascii="Times New Roman" w:hAnsi="Times New Roman" w:cs="Times New Roman"/>
+        </w:rPr>
+        <w:t>secara</w:t>
+      </w:r>
+      <w:proofErr w:type="spellEnd"/>
+      <w:r>
+        <w:rPr>
+          <w:rFonts w:ascii="Times New Roman" w:hAnsi="Times New Roman" w:cs="Times New Roman"/>
+        </w:rPr>
+        <w:t xml:space="preserve"> </w:t>
+      </w:r>
+      <w:proofErr w:type="spellStart"/>
+      <w:r>
+        <w:rPr>
+          <w:rFonts w:ascii="Times New Roman" w:hAnsi="Times New Roman" w:cs="Times New Roman"/>
+        </w:rPr>
+        <w:t>otomatis</w:t>
+      </w:r>
+      <w:proofErr w:type="spellEnd"/>
+      <w:r>
+        <w:rPr>
+          <w:rFonts w:ascii="Times New Roman" w:hAnsi="Times New Roman" w:cs="Times New Roman"/>
+        </w:rPr>
+        <w:t xml:space="preserve"> dan </w:t>
+      </w:r>
+      <w:proofErr w:type="spellStart"/>
+      <w:r>
+        <w:rPr>
+          <w:rFonts w:ascii="Times New Roman" w:hAnsi="Times New Roman" w:cs="Times New Roman"/>
+        </w:rPr>
+        <w:t>menampilkan</w:t>
+      </w:r>
+      <w:proofErr w:type="spellEnd"/>
+      <w:r>
+        <w:rPr>
+          <w:rFonts w:ascii="Times New Roman" w:hAnsi="Times New Roman" w:cs="Times New Roman"/>
+        </w:rPr>
+        <w:t xml:space="preserve"> </w:t>
+      </w:r>
+      <w:proofErr w:type="spellStart"/>
+      <w:r>
+        <w:rPr>
+          <w:rFonts w:ascii="Times New Roman" w:hAnsi="Times New Roman" w:cs="Times New Roman"/>
+        </w:rPr>
+        <w:t>informasi</w:t>
+      </w:r>
+      <w:proofErr w:type="spellEnd"/>
+      <w:r>
+        <w:rPr>
+          <w:rFonts w:ascii="Times New Roman" w:hAnsi="Times New Roman" w:cs="Times New Roman"/>
+        </w:rPr>
+        <w:t xml:space="preserve"> </w:t>
+      </w:r>
+      <w:proofErr w:type="spellStart"/>
+      <w:r>
+        <w:rPr>
+          <w:rFonts w:ascii="Times New Roman" w:hAnsi="Times New Roman" w:cs="Times New Roman"/>
+        </w:rPr>
+        <w:t>transaksi</w:t>
+      </w:r>
+      <w:proofErr w:type="spellEnd"/>
+      <w:r>
+        <w:rPr>
+          <w:rFonts w:ascii="Times New Roman" w:hAnsi="Times New Roman" w:cs="Times New Roman"/>
+        </w:rPr>
+        <w:t xml:space="preserve"> </w:t>
+      </w:r>
+      <w:proofErr w:type="spellStart"/>
+      <w:r>
+        <w:rPr>
+          <w:rFonts w:ascii="Times New Roman" w:hAnsi="Times New Roman" w:cs="Times New Roman"/>
+        </w:rPr>
+        <w:t>dengan</w:t>
+      </w:r>
+      <w:proofErr w:type="spellEnd"/>
+      <w:r>
+        <w:rPr>
+          <w:rFonts w:ascii="Times New Roman" w:hAnsi="Times New Roman" w:cs="Times New Roman"/>
+        </w:rPr>
+        <w:t xml:space="preserve"> </w:t>
+      </w:r>
+      <w:proofErr w:type="spellStart"/>
+      <w:r>
+        <w:rPr>
+          <w:rFonts w:ascii="Times New Roman" w:hAnsi="Times New Roman" w:cs="Times New Roman"/>
+        </w:rPr>
+        <w:t>lebih</w:t>
+      </w:r>
+      <w:proofErr w:type="spellEnd"/>
+      <w:r>
+        <w:rPr>
+          <w:rFonts w:ascii="Times New Roman" w:hAnsi="Times New Roman" w:cs="Times New Roman"/>
+        </w:rPr>
+        <w:t xml:space="preserve"> </w:t>
+      </w:r>
+      <w:proofErr w:type="spellStart"/>
+      <w:r>
+        <w:rPr>
+          <w:rFonts w:ascii="Times New Roman" w:hAnsi="Times New Roman" w:cs="Times New Roman"/>
+        </w:rPr>
+        <w:t>stabil</w:t>
+      </w:r>
+      <w:proofErr w:type="spellEnd"/>
+      <w:r>
+        <w:rPr>
+          <w:rFonts w:ascii="Times New Roman" w:hAnsi="Times New Roman" w:cs="Times New Roman"/>
+        </w:rPr>
+        <w:t xml:space="preserve"> </w:t>
+      </w:r>
+      <w:proofErr w:type="spellStart"/>
+      <w:r>
+        <w:rPr>
+          <w:rFonts w:ascii="Times New Roman" w:hAnsi="Times New Roman" w:cs="Times New Roman"/>
+        </w:rPr>
+        <w:t>serta</w:t>
+      </w:r>
+      <w:proofErr w:type="spellEnd"/>
+      <w:r>
+        <w:rPr>
+          <w:rFonts w:ascii="Times New Roman" w:hAnsi="Times New Roman" w:cs="Times New Roman"/>
+        </w:rPr>
+        <w:t xml:space="preserve"> </w:t>
+      </w:r>
+      <w:proofErr w:type="spellStart"/>
+      <w:r>
+        <w:rPr>
+          <w:rFonts w:ascii="Times New Roman" w:hAnsi="Times New Roman" w:cs="Times New Roman"/>
+        </w:rPr>
+        <w:t>akurat</w:t>
+      </w:r>
+      <w:proofErr w:type="spellEnd"/>
+      <w:r>
+        <w:rPr>
+          <w:rFonts w:ascii="Times New Roman" w:hAnsi="Times New Roman" w:cs="Times New Roman"/>
+        </w:rPr>
+        <w:t>.</w:t>
+      </w:r>
+    </w:p>
+    <w:p>
+      <w:pPr>
+        <w:pStyle w:val="ListParagraph"/>
+        <w:jc w:val="both"/>
+        <w:rPr>
+          <w:rFonts w:ascii="Times New Roman" w:hAnsi="Times New Roman" w:cs="Times New Roman"/>
+        </w:rPr>
+      </w:pPr>
+    </w:p>
+    <w:p>
+      <w:pPr>
+        <w:pStyle w:val="ListParagraph"/>
+        <w:jc w:val="both"/>
+      </w:pPr>
+      <w:r>
+        <w:rPr>
+          <w:rFonts w:ascii="Times New Roman" w:hAnsi="Times New Roman" w:cs="Times New Roman"/>
+        </w:rPr>
+        <w:t>6.</w:t>
+      </w:r>
+      <w:r>
+        <w:rPr>
+          <w:rFonts w:ascii="Times New Roman" w:eastAsia="Times New Roman" w:hAnsi="Times New Roman" w:cs="Times New Roman"/>
+          <w:b/>
+          <w:bCs/>
+          <w:kern w:val="0"/>
+          <w14:ligatures w14:val="none"/>
+        </w:rPr>
+        <w:t xml:space="preserve"> </w:t>
+      </w:r>
+      <w:r>
+        <w:rPr>
+          <w:b/>
+          <w:bCs/>
+        </w:rPr>
+        <w:t xml:space="preserve">QR Code </w:t>
+      </w:r>
+      <w:proofErr w:type="spellStart"/>
+      <w:r>
+        <w:rPr>
+          <w:b/>
+          <w:bCs/>
+        </w:rPr>
+        <w:t>Tiket</w:t>
+      </w:r>
+      <w:proofErr w:type="spellEnd"/>
+    </w:p>
+    <w:p>
+      <w:pPr>
+        <w:pStyle w:val="ListParagraph"/>
+        <w:jc w:val="both"/>
+        <w:rPr>
+          <w:rFonts w:ascii="Times New Roman" w:hAnsi="Times New Roman" w:cs="Times New Roman"/>
+        </w:rPr>
+      </w:pPr>
+      <w:r>
+        <w:rPr>
+          <w:rFonts w:ascii="Times New Roman" w:hAnsi="Times New Roman" w:cs="Times New Roman"/>
+        </w:rPr>
+        <w:drawing>
+          <wp:inline distT="0" distB="0" distL="0" distR="0" wp14:anchorId="32A902C9" wp14:editId="0F62CEAA">
+            <wp:extent cx="5555129" cy="2724150"/>
+            <wp:effectExtent l="0" t="0" r="7620" b="0"/>
+            <wp:docPr id="672151634" name="Picture 1"/>
+            <wp:cNvGraphicFramePr>
+              <a:graphicFrameLocks xmlns:a="http://schemas.openxmlformats.org/drawingml/2006/main" noChangeAspect="1"/>
+            </wp:cNvGraphicFramePr>
+            <a:graphic xmlns:a="http://schemas.openxmlformats.org/drawingml/2006/main">
+              <a:graphicData uri="http://schemas.openxmlformats.org/drawingml/2006/picture">
+                <pic:pic xmlns:pic="http://schemas.openxmlformats.org/drawingml/2006/picture">
+                  <pic:nvPicPr>
+                    <pic:cNvPr id="672151634" name=""/>
+                    <pic:cNvPicPr/>
+                  </pic:nvPicPr>
+                  <pic:blipFill rotWithShape="1">
+                    <a:blip r:embed="rId12"/>
+                    <a:srcRect t="5698" b="7123"/>
+                    <a:stretch>
+                      <a:fillRect/>
+                    </a:stretch>
+                  </pic:blipFill>
+                  <pic:spPr bwMode="auto">
+                    <a:xfrm>
+                      <a:off x="0" y="0"/>
+                      <a:ext cx="5555977" cy="2724566"/>
+                    </a:xfrm>
+                    <a:prstGeom prst="rect">
+                      <a:avLst/>
+                    </a:prstGeom>
+                    <a:ln>
+                      <a:noFill/>
+                    </a:ln>
+                    <a:extLst>
+                      <a:ext uri="{53640926-AAD7-44D8-BBD7-CCE9431645EC}">
+                        <a14:shadowObscured xmlns:a14="http://schemas.microsoft.com/office/drawing/2010/main"/>
+                      </a:ext>
+                    </a:extLst>
+                  </pic:spPr>
+                </pic:pic>
+              </a:graphicData>
+            </a:graphic>
+          </wp:inline>
+        </w:drawing>
+      </w:r>
+    </w:p>
+    <w:p>
+      <w:pPr>
+        <w:pStyle w:val="ListParagraph"/>
+        <w:jc w:val="both"/>
+        <w:rPr>
+          <w:rFonts w:ascii="Times New Roman" w:hAnsi="Times New Roman" w:cs="Times New Roman"/>
+        </w:rPr>
+      </w:pPr>
+      <w:proofErr w:type="spellStart"/>
+      <w:r>
+        <w:rPr>
+          <w:rFonts w:ascii="Times New Roman" w:hAnsi="Times New Roman" w:cs="Times New Roman"/>
+        </w:rPr>
+        <w:t>Berhasil</w:t>
+      </w:r>
+      <w:proofErr w:type="spellEnd"/>
+      <w:r>
+        <w:rPr>
+          <w:rFonts w:ascii="Times New Roman" w:hAnsi="Times New Roman" w:cs="Times New Roman"/>
+        </w:rPr>
+        <w:t xml:space="preserve"> </w:t>
+      </w:r>
+      <w:proofErr w:type="spellStart"/>
+      <w:r>
+        <w:rPr>
+          <w:rFonts w:ascii="Times New Roman" w:hAnsi="Times New Roman" w:cs="Times New Roman"/>
+        </w:rPr>
+        <w:t>menambahkan</w:t>
+      </w:r>
+      <w:proofErr w:type="spellEnd"/>
+      <w:r>
+        <w:rPr>
+          <w:rFonts w:ascii="Times New Roman" w:hAnsi="Times New Roman" w:cs="Times New Roman"/>
+        </w:rPr>
+        <w:t xml:space="preserve"> </w:t>
+      </w:r>
+      <w:proofErr w:type="spellStart"/>
+      <w:r>
+        <w:rPr>
+          <w:rFonts w:ascii="Times New Roman" w:hAnsi="Times New Roman" w:cs="Times New Roman"/>
+        </w:rPr>
+        <w:t>fitur</w:t>
+      </w:r>
+      <w:proofErr w:type="spellEnd"/>
+      <w:r>
+        <w:rPr>
+          <w:rFonts w:ascii="Times New Roman" w:hAnsi="Times New Roman" w:cs="Times New Roman"/>
+        </w:rPr>
+        <w:t xml:space="preserve"> QR Code pada </w:t>
+      </w:r>
+      <w:proofErr w:type="spellStart"/>
+      <w:r>
+        <w:rPr>
+          <w:rFonts w:ascii="Times New Roman" w:hAnsi="Times New Roman" w:cs="Times New Roman"/>
+        </w:rPr>
+        <w:t>halaman</w:t>
+      </w:r>
+      <w:proofErr w:type="spellEnd"/>
+      <w:r>
+        <w:rPr>
+          <w:rFonts w:ascii="Times New Roman" w:hAnsi="Times New Roman" w:cs="Times New Roman"/>
+        </w:rPr>
+        <w:t xml:space="preserve"> E-Ticket </w:t>
+      </w:r>
+      <w:proofErr w:type="spellStart"/>
+      <w:r>
+        <w:rPr>
+          <w:rFonts w:ascii="Times New Roman" w:hAnsi="Times New Roman" w:cs="Times New Roman"/>
+        </w:rPr>
+        <w:t>setelah</w:t>
+      </w:r>
+      <w:proofErr w:type="spellEnd"/>
+      <w:r>
+        <w:rPr>
+          <w:rFonts w:ascii="Times New Roman" w:hAnsi="Times New Roman" w:cs="Times New Roman"/>
+        </w:rPr>
+        <w:t xml:space="preserve"> proses </w:t>
+      </w:r>
+      <w:proofErr w:type="spellStart"/>
+      <w:r>
+        <w:rPr>
+          <w:rFonts w:ascii="Times New Roman" w:hAnsi="Times New Roman" w:cs="Times New Roman"/>
+        </w:rPr>
+        <w:t>pembayaran</w:t>
+      </w:r>
+      <w:proofErr w:type="spellEnd"/>
+      <w:r>
+        <w:rPr>
+          <w:rFonts w:ascii="Times New Roman" w:hAnsi="Times New Roman" w:cs="Times New Roman"/>
+        </w:rPr>
+        <w:t xml:space="preserve"> </w:t>
+      </w:r>
+      <w:proofErr w:type="spellStart"/>
+      <w:r>
+        <w:rPr>
+          <w:rFonts w:ascii="Times New Roman" w:hAnsi="Times New Roman" w:cs="Times New Roman"/>
+        </w:rPr>
+        <w:t>berhasil</w:t>
+      </w:r>
+      <w:proofErr w:type="spellEnd"/>
+      <w:r>
+        <w:rPr>
+          <w:rFonts w:ascii="Times New Roman" w:hAnsi="Times New Roman" w:cs="Times New Roman"/>
+        </w:rPr>
+        <w:t xml:space="preserve">. QR Code </w:t>
+      </w:r>
+      <w:proofErr w:type="spellStart"/>
+      <w:r>
+        <w:rPr>
+          <w:rFonts w:ascii="Times New Roman" w:hAnsi="Times New Roman" w:cs="Times New Roman"/>
+        </w:rPr>
+        <w:t>dihasilkan</w:t>
+      </w:r>
+      <w:proofErr w:type="spellEnd"/>
+      <w:r>
+        <w:rPr>
+          <w:rFonts w:ascii="Times New Roman" w:hAnsi="Times New Roman" w:cs="Times New Roman"/>
+        </w:rPr>
+        <w:t xml:space="preserve"> </w:t>
+      </w:r>
+      <w:proofErr w:type="spellStart"/>
+      <w:r>
+        <w:rPr>
+          <w:rFonts w:ascii="Times New Roman" w:hAnsi="Times New Roman" w:cs="Times New Roman"/>
+        </w:rPr>
+        <w:t>secara</w:t>
+      </w:r>
+      <w:proofErr w:type="spellEnd"/>
+      <w:r>
+        <w:rPr>
+          <w:rFonts w:ascii="Times New Roman" w:hAnsi="Times New Roman" w:cs="Times New Roman"/>
+        </w:rPr>
+        <w:t xml:space="preserve"> </w:t>
+      </w:r>
+      <w:proofErr w:type="spellStart"/>
+      <w:r>
+        <w:rPr>
+          <w:rFonts w:ascii="Times New Roman" w:hAnsi="Times New Roman" w:cs="Times New Roman"/>
+        </w:rPr>
+        <w:t>otomatis</w:t>
+      </w:r>
+      <w:proofErr w:type="spellEnd"/>
+      <w:r>
+        <w:rPr>
+          <w:rFonts w:ascii="Times New Roman" w:hAnsi="Times New Roman" w:cs="Times New Roman"/>
+        </w:rPr>
+        <w:t xml:space="preserve"> </w:t>
+      </w:r>
+      <w:proofErr w:type="spellStart"/>
+      <w:r>
+        <w:rPr>
+          <w:rFonts w:ascii="Times New Roman" w:hAnsi="Times New Roman" w:cs="Times New Roman"/>
+        </w:rPr>
+        <w:t>berdasarkan</w:t>
+      </w:r>
+      <w:proofErr w:type="spellEnd"/>
+      <w:r>
+        <w:rPr>
+          <w:rFonts w:ascii="Times New Roman" w:hAnsi="Times New Roman" w:cs="Times New Roman"/>
+        </w:rPr>
+        <w:t xml:space="preserve"> </w:t>
+      </w:r>
+      <w:proofErr w:type="spellStart"/>
+      <w:r>
+        <w:rPr>
+          <w:rFonts w:ascii="Times New Roman" w:hAnsi="Times New Roman" w:cs="Times New Roman"/>
+        </w:rPr>
+        <w:t>kode</w:t>
+      </w:r>
+      <w:proofErr w:type="spellEnd"/>
+      <w:r>
+        <w:rPr>
+          <w:rFonts w:ascii="Times New Roman" w:hAnsi="Times New Roman" w:cs="Times New Roman"/>
+        </w:rPr>
+        <w:t xml:space="preserve"> booking dan </w:t>
+      </w:r>
+      <w:proofErr w:type="spellStart"/>
+      <w:r>
+        <w:rPr>
+          <w:rFonts w:ascii="Times New Roman" w:hAnsi="Times New Roman" w:cs="Times New Roman"/>
+        </w:rPr>
+        <w:t>ditampilkan</w:t>
+      </w:r>
+      <w:proofErr w:type="spellEnd"/>
+      <w:r>
+        <w:rPr>
+          <w:rFonts w:ascii="Times New Roman" w:hAnsi="Times New Roman" w:cs="Times New Roman"/>
+        </w:rPr>
+        <w:t xml:space="preserve"> pada </w:t>
+      </w:r>
+      <w:proofErr w:type="spellStart"/>
+      <w:r>
+        <w:rPr>
+          <w:rFonts w:ascii="Times New Roman" w:hAnsi="Times New Roman" w:cs="Times New Roman"/>
+        </w:rPr>
+        <w:t>halaman</w:t>
+      </w:r>
+      <w:proofErr w:type="spellEnd"/>
+      <w:r>
+        <w:rPr>
+          <w:rFonts w:ascii="Times New Roman" w:hAnsi="Times New Roman" w:cs="Times New Roman"/>
+        </w:rPr>
+        <w:t xml:space="preserve"> </w:t>
+      </w:r>
+      <w:proofErr w:type="spellStart"/>
+      <w:r>
+        <w:rPr>
+          <w:rFonts w:ascii="Times New Roman" w:hAnsi="Times New Roman" w:cs="Times New Roman"/>
+        </w:rPr>
+        <w:t>tiket</w:t>
+      </w:r>
+      <w:proofErr w:type="spellEnd"/>
+      <w:r>
+        <w:rPr>
+          <w:rFonts w:ascii="Times New Roman" w:hAnsi="Times New Roman" w:cs="Times New Roman"/>
+        </w:rPr>
+        <w:t xml:space="preserve"> </w:t>
+      </w:r>
+      <w:proofErr w:type="spellStart"/>
+      <w:r>
+        <w:rPr>
+          <w:rFonts w:ascii="Times New Roman" w:hAnsi="Times New Roman" w:cs="Times New Roman"/>
+        </w:rPr>
+        <w:t>pengguna</w:t>
+      </w:r>
+      <w:proofErr w:type="spellEnd"/>
+      <w:r>
+        <w:rPr>
+          <w:rFonts w:ascii="Times New Roman" w:hAnsi="Times New Roman" w:cs="Times New Roman"/>
+        </w:rPr>
+        <w:t xml:space="preserve"> </w:t>
+      </w:r>
+      <w:proofErr w:type="spellStart"/>
+      <w:r>
+        <w:rPr>
+          <w:rFonts w:ascii="Times New Roman" w:hAnsi="Times New Roman" w:cs="Times New Roman"/>
+        </w:rPr>
+        <w:t>serta</w:t>
+      </w:r>
+      <w:proofErr w:type="spellEnd"/>
+      <w:r>
+        <w:rPr>
+          <w:rFonts w:ascii="Times New Roman" w:hAnsi="Times New Roman" w:cs="Times New Roman"/>
+        </w:rPr>
+        <w:t xml:space="preserve"> </w:t>
+      </w:r>
+      <w:proofErr w:type="spellStart"/>
+      <w:r>
+        <w:rPr>
+          <w:rFonts w:ascii="Times New Roman" w:hAnsi="Times New Roman" w:cs="Times New Roman"/>
+        </w:rPr>
+        <w:t>halaman</w:t>
+      </w:r>
+      <w:proofErr w:type="spellEnd"/>
+      <w:r>
+        <w:rPr>
+          <w:rFonts w:ascii="Times New Roman" w:hAnsi="Times New Roman" w:cs="Times New Roman"/>
+        </w:rPr>
+        <w:t xml:space="preserve"> </w:t>
+      </w:r>
+      <w:proofErr w:type="spellStart"/>
+      <w:r>
+        <w:rPr>
+          <w:rFonts w:ascii="Times New Roman" w:hAnsi="Times New Roman" w:cs="Times New Roman"/>
+        </w:rPr>
+        <w:t>sukses</w:t>
+      </w:r>
+      <w:proofErr w:type="spellEnd"/>
+      <w:r>
+        <w:rPr>
+          <w:rFonts w:ascii="Times New Roman" w:hAnsi="Times New Roman" w:cs="Times New Roman"/>
+        </w:rPr>
+        <w:t xml:space="preserve"> </w:t>
+      </w:r>
+      <w:proofErr w:type="spellStart"/>
+      <w:r>
+        <w:rPr>
+          <w:rFonts w:ascii="Times New Roman" w:hAnsi="Times New Roman" w:cs="Times New Roman"/>
+        </w:rPr>
+        <w:t>pembayaran</w:t>
+      </w:r>
+      <w:proofErr w:type="spellEnd"/>
+      <w:r>
+        <w:rPr>
+          <w:rFonts w:ascii="Times New Roman" w:hAnsi="Times New Roman" w:cs="Times New Roman"/>
+        </w:rPr>
+        <w:t xml:space="preserve">. Fitur </w:t>
+      </w:r>
+      <w:proofErr w:type="spellStart"/>
+      <w:r>
+        <w:rPr>
+          <w:rFonts w:ascii="Times New Roman" w:hAnsi="Times New Roman" w:cs="Times New Roman"/>
+        </w:rPr>
+        <w:t>ini</w:t>
+      </w:r>
+      <w:proofErr w:type="spellEnd"/>
+      <w:r>
+        <w:rPr>
+          <w:rFonts w:ascii="Times New Roman" w:hAnsi="Times New Roman" w:cs="Times New Roman"/>
+        </w:rPr>
+        <w:t xml:space="preserve"> </w:t>
+      </w:r>
+      <w:proofErr w:type="spellStart"/>
+      <w:r>
+        <w:rPr>
+          <w:rFonts w:ascii="Times New Roman" w:hAnsi="Times New Roman" w:cs="Times New Roman"/>
+        </w:rPr>
+        <w:t>mempermudah</w:t>
+      </w:r>
+      <w:proofErr w:type="spellEnd"/>
+      <w:r>
+        <w:rPr>
+          <w:rFonts w:ascii="Times New Roman" w:hAnsi="Times New Roman" w:cs="Times New Roman"/>
+        </w:rPr>
+        <w:t xml:space="preserve"> proses </w:t>
+      </w:r>
+      <w:proofErr w:type="spellStart"/>
+      <w:r>
+        <w:rPr>
+          <w:rFonts w:ascii="Times New Roman" w:hAnsi="Times New Roman" w:cs="Times New Roman"/>
+        </w:rPr>
+        <w:t>verifikasi</w:t>
+      </w:r>
+      <w:proofErr w:type="spellEnd"/>
+      <w:r>
+        <w:rPr>
+          <w:rFonts w:ascii="Times New Roman" w:hAnsi="Times New Roman" w:cs="Times New Roman"/>
+        </w:rPr>
+        <w:t xml:space="preserve"> </w:t>
+      </w:r>
+      <w:proofErr w:type="spellStart"/>
+      <w:r>
+        <w:rPr>
+          <w:rFonts w:ascii="Times New Roman" w:hAnsi="Times New Roman" w:cs="Times New Roman"/>
+        </w:rPr>
+        <w:t>tiket</w:t>
+      </w:r>
+      <w:proofErr w:type="spellEnd"/>
+      <w:r>
+        <w:rPr>
+          <w:rFonts w:ascii="Times New Roman" w:hAnsi="Times New Roman" w:cs="Times New Roman"/>
+        </w:rPr>
+        <w:t xml:space="preserve"> </w:t>
+      </w:r>
+      <w:proofErr w:type="spellStart"/>
+      <w:r>
+        <w:rPr>
+          <w:rFonts w:ascii="Times New Roman" w:hAnsi="Times New Roman" w:cs="Times New Roman"/>
+        </w:rPr>
+        <w:t>saat</w:t>
+      </w:r>
+      <w:proofErr w:type="spellEnd"/>
+      <w:r>
+        <w:rPr>
+          <w:rFonts w:ascii="Times New Roman" w:hAnsi="Times New Roman" w:cs="Times New Roman"/>
+        </w:rPr>
+        <w:t xml:space="preserve"> </w:t>
+      </w:r>
+      <w:proofErr w:type="spellStart"/>
+      <w:r>
+        <w:rPr>
+          <w:rFonts w:ascii="Times New Roman" w:hAnsi="Times New Roman" w:cs="Times New Roman"/>
+        </w:rPr>
+        <w:t>pengunjung</w:t>
+      </w:r>
+      <w:proofErr w:type="spellEnd"/>
+      <w:r>
+        <w:rPr>
+          <w:rFonts w:ascii="Times New Roman" w:hAnsi="Times New Roman" w:cs="Times New Roman"/>
+        </w:rPr>
+        <w:t xml:space="preserve"> </w:t>
+      </w:r>
+      <w:proofErr w:type="spellStart"/>
+      <w:r>
+        <w:rPr>
+          <w:rFonts w:ascii="Times New Roman" w:hAnsi="Times New Roman" w:cs="Times New Roman"/>
+        </w:rPr>
+        <w:t>memasuki</w:t>
+      </w:r>
+      <w:proofErr w:type="spellEnd"/>
+      <w:r>
+        <w:rPr>
+          <w:rFonts w:ascii="Times New Roman" w:hAnsi="Times New Roman" w:cs="Times New Roman"/>
+        </w:rPr>
+        <w:t xml:space="preserve"> </w:t>
+      </w:r>
+      <w:proofErr w:type="spellStart"/>
+      <w:r>
+        <w:rPr>
+          <w:rFonts w:ascii="Times New Roman" w:hAnsi="Times New Roman" w:cs="Times New Roman"/>
+        </w:rPr>
+        <w:t>kawasan</w:t>
+      </w:r>
+      <w:proofErr w:type="spellEnd"/>
+      <w:r>
+        <w:rPr>
+          <w:rFonts w:ascii="Times New Roman" w:hAnsi="Times New Roman" w:cs="Times New Roman"/>
+        </w:rPr>
+        <w:t xml:space="preserve"> </w:t>
+      </w:r>
+      <w:proofErr w:type="spellStart"/>
+      <w:r>
+        <w:rPr>
+          <w:rFonts w:ascii="Times New Roman" w:hAnsi="Times New Roman" w:cs="Times New Roman"/>
+        </w:rPr>
+        <w:t>wisata</w:t>
+      </w:r>
+      <w:proofErr w:type="spellEnd"/>
+      <w:r>
+        <w:rPr>
+          <w:rFonts w:ascii="Times New Roman" w:hAnsi="Times New Roman" w:cs="Times New Roman"/>
+        </w:rPr>
+        <w:t xml:space="preserve"> </w:t>
+      </w:r>
+      <w:proofErr w:type="spellStart"/>
+      <w:r>
+        <w:rPr>
+          <w:rFonts w:ascii="Times New Roman" w:hAnsi="Times New Roman" w:cs="Times New Roman"/>
+        </w:rPr>
+        <w:t>dengan</w:t>
+      </w:r>
+      <w:proofErr w:type="spellEnd"/>
+      <w:r>
+        <w:rPr>
+          <w:rFonts w:ascii="Times New Roman" w:hAnsi="Times New Roman" w:cs="Times New Roman"/>
+        </w:rPr>
+        <w:t xml:space="preserve"> </w:t>
+      </w:r>
+      <w:proofErr w:type="spellStart"/>
+      <w:r>
+        <w:rPr>
+          <w:rFonts w:ascii="Times New Roman" w:hAnsi="Times New Roman" w:cs="Times New Roman"/>
+        </w:rPr>
+        <w:t>sistem</w:t>
+      </w:r>
+      <w:proofErr w:type="spellEnd"/>
+      <w:r>
+        <w:rPr>
+          <w:rFonts w:ascii="Times New Roman" w:hAnsi="Times New Roman" w:cs="Times New Roman"/>
+        </w:rPr>
+        <w:t xml:space="preserve"> scan digital yang </w:t>
+      </w:r>
+      <w:proofErr w:type="spellStart"/>
+      <w:r>
+        <w:rPr>
+          <w:rFonts w:ascii="Times New Roman" w:hAnsi="Times New Roman" w:cs="Times New Roman"/>
+        </w:rPr>
+        <w:t>lebih</w:t>
+      </w:r>
+      <w:proofErr w:type="spellEnd"/>
+      <w:r>
+        <w:rPr>
+          <w:rFonts w:ascii="Times New Roman" w:hAnsi="Times New Roman" w:cs="Times New Roman"/>
+        </w:rPr>
+        <w:t xml:space="preserve"> </w:t>
+      </w:r>
+      <w:proofErr w:type="spellStart"/>
+      <w:r>
+        <w:rPr>
+          <w:rFonts w:ascii="Times New Roman" w:hAnsi="Times New Roman" w:cs="Times New Roman"/>
+        </w:rPr>
+        <w:t>cepat</w:t>
+      </w:r>
+      <w:proofErr w:type="spellEnd"/>
+      <w:r>
+        <w:rPr>
+          <w:rFonts w:ascii="Times New Roman" w:hAnsi="Times New Roman" w:cs="Times New Roman"/>
+        </w:rPr>
+        <w:t xml:space="preserve"> dan </w:t>
+      </w:r>
+      <w:proofErr w:type="spellStart"/>
+      <w:r>
+        <w:rPr>
+          <w:rFonts w:ascii="Times New Roman" w:hAnsi="Times New Roman" w:cs="Times New Roman"/>
+        </w:rPr>
+        <w:t>efisien</w:t>
+      </w:r>
+      <w:proofErr w:type="spellEnd"/>
+      <w:r>
+        <w:rPr>
+          <w:rFonts w:ascii="Times New Roman" w:hAnsi="Times New Roman" w:cs="Times New Roman"/>
+        </w:rPr>
+        <w:t>.</w:t>
       </w:r>
     </w:p>
     <w:sectPr>

</xml_diff>

<commit_message>
Update dokumentasi Word dan perbaikan fitur tiket
</commit_message>
<xml_diff>
--- a/dokumentasi/Putri Nuraini_23312243 tahap3.docx
+++ b/dokumentasi/Putri Nuraini_23312243 tahap3.docx
@@ -2664,7 +2664,7 @@
     <w:p>
       <w:pPr>
         <w:pStyle w:val="ListParagraph"/>
-        <w:jc w:val="both"/>
+        <w:jc w:val="center"/>
         <w:rPr>
           <w:rFonts w:ascii="Times New Roman" w:hAnsi="Times New Roman" w:cs="Times New Roman"/>
         </w:rPr>
@@ -2674,9 +2674,9 @@
           <w:rFonts w:ascii="Times New Roman" w:hAnsi="Times New Roman" w:cs="Times New Roman"/>
         </w:rPr>
         <w:drawing>
-          <wp:inline distT="0" distB="0" distL="0" distR="0" wp14:anchorId="32A902C9" wp14:editId="0F62CEAA">
-            <wp:extent cx="5555129" cy="2724150"/>
-            <wp:effectExtent l="0" t="0" r="7620" b="0"/>
+          <wp:inline distT="0" distB="0" distL="0" distR="0" wp14:anchorId="32A902C9" wp14:editId="15B3AE51">
+            <wp:extent cx="3079750" cy="2724077"/>
+            <wp:effectExtent l="0" t="0" r="6350" b="635"/>
             <wp:docPr id="672151634" name="Picture 1"/>
             <wp:cNvGraphicFramePr>
               <a:graphicFrameLocks xmlns:a="http://schemas.openxmlformats.org/drawingml/2006/main" noChangeAspect="1"/>
@@ -2690,7 +2690,7 @@
                   </pic:nvPicPr>
                   <pic:blipFill rotWithShape="1">
                     <a:blip r:embed="rId12"/>
-                    <a:srcRect t="5698" b="7123"/>
+                    <a:srcRect t="5698" r="44559" b="7123"/>
                     <a:stretch>
                       <a:fillRect/>
                     </a:stretch>
@@ -2698,7 +2698,7 @@
                   <pic:spPr bwMode="auto">
                     <a:xfrm>
                       <a:off x="0" y="0"/>
-                      <a:ext cx="5555977" cy="2724566"/>
+                      <a:ext cx="3080303" cy="2724566"/>
                     </a:xfrm>
                     <a:prstGeom prst="rect">
                       <a:avLst/>

</xml_diff>

<commit_message>
Memperbaiki koneksi kategori antara frontend dan backend
</commit_message>
<xml_diff>
--- a/dokumentasi/Putri Nuraini_23312243 tahap3.docx
+++ b/dokumentasi/Putri Nuraini_23312243 tahap3.docx
@@ -8,19 +8,11 @@
           <w:rFonts w:ascii="Times New Roman" w:hAnsi="Times New Roman" w:cs="Times New Roman"/>
         </w:rPr>
       </w:pPr>
-      <w:proofErr w:type="gramStart"/>
-      <w:r>
-        <w:rPr>
-          <w:rFonts w:ascii="Times New Roman" w:hAnsi="Times New Roman" w:cs="Times New Roman"/>
-        </w:rPr>
-        <w:t>NAMA :</w:t>
-      </w:r>
-      <w:proofErr w:type="gramEnd"/>
-      <w:r>
-        <w:rPr>
-          <w:rFonts w:ascii="Times New Roman" w:hAnsi="Times New Roman" w:cs="Times New Roman"/>
-        </w:rPr>
-        <w:t xml:space="preserve"> PUTRI NURAINI</w:t>
+      <w:r>
+        <w:rPr>
+          <w:rFonts w:ascii="Times New Roman" w:hAnsi="Times New Roman" w:cs="Times New Roman"/>
+        </w:rPr>
+        <w:t>NAMA : PUTRI NURAINI</w:t>
       </w:r>
     </w:p>
     <w:p>
@@ -29,19 +21,11 @@
           <w:rFonts w:ascii="Times New Roman" w:hAnsi="Times New Roman" w:cs="Times New Roman"/>
         </w:rPr>
       </w:pPr>
-      <w:proofErr w:type="gramStart"/>
-      <w:r>
-        <w:rPr>
-          <w:rFonts w:ascii="Times New Roman" w:hAnsi="Times New Roman" w:cs="Times New Roman"/>
-        </w:rPr>
-        <w:t>NPM :</w:t>
-      </w:r>
-      <w:proofErr w:type="gramEnd"/>
-      <w:r>
-        <w:rPr>
-          <w:rFonts w:ascii="Times New Roman" w:hAnsi="Times New Roman" w:cs="Times New Roman"/>
-        </w:rPr>
-        <w:t xml:space="preserve"> 23312243</w:t>
+      <w:r>
+        <w:rPr>
+          <w:rFonts w:ascii="Times New Roman" w:hAnsi="Times New Roman" w:cs="Times New Roman"/>
+        </w:rPr>
+        <w:t>NPM : 23312243</w:t>
       </w:r>
     </w:p>
     <w:p>
@@ -50,19 +34,11 @@
           <w:rFonts w:ascii="Times New Roman" w:hAnsi="Times New Roman" w:cs="Times New Roman"/>
         </w:rPr>
       </w:pPr>
-      <w:proofErr w:type="gramStart"/>
-      <w:r>
-        <w:rPr>
-          <w:rFonts w:ascii="Times New Roman" w:hAnsi="Times New Roman" w:cs="Times New Roman"/>
-        </w:rPr>
-        <w:t>KELAS :</w:t>
-      </w:r>
-      <w:proofErr w:type="gramEnd"/>
-      <w:r>
-        <w:rPr>
-          <w:rFonts w:ascii="Times New Roman" w:hAnsi="Times New Roman" w:cs="Times New Roman"/>
-        </w:rPr>
-        <w:t xml:space="preserve"> IF23FX</w:t>
+      <w:r>
+        <w:rPr>
+          <w:rFonts w:ascii="Times New Roman" w:hAnsi="Times New Roman" w:cs="Times New Roman"/>
+        </w:rPr>
+        <w:t>KELAS : IF23FX</w:t>
       </w:r>
     </w:p>
     <w:p>
@@ -71,19 +47,11 @@
           <w:rFonts w:ascii="Times New Roman" w:hAnsi="Times New Roman" w:cs="Times New Roman"/>
         </w:rPr>
       </w:pPr>
-      <w:proofErr w:type="gramStart"/>
-      <w:r>
-        <w:rPr>
-          <w:rFonts w:ascii="Times New Roman" w:hAnsi="Times New Roman" w:cs="Times New Roman"/>
-        </w:rPr>
-        <w:t>TAHAP :</w:t>
-      </w:r>
-      <w:proofErr w:type="gramEnd"/>
-      <w:r>
-        <w:rPr>
-          <w:rFonts w:ascii="Times New Roman" w:hAnsi="Times New Roman" w:cs="Times New Roman"/>
-        </w:rPr>
-        <w:t xml:space="preserve"> 3</w:t>
+      <w:r>
+        <w:rPr>
+          <w:rFonts w:ascii="Times New Roman" w:hAnsi="Times New Roman" w:cs="Times New Roman"/>
+        </w:rPr>
+        <w:t>TAHAP : 3</w:t>
       </w:r>
     </w:p>
     <w:p>
@@ -266,7 +234,6 @@
         <w:t xml:space="preserve"> dan </w:t>
       </w:r>
       <w:proofErr w:type="spellStart"/>
-      <w:proofErr w:type="gramStart"/>
       <w:r>
         <w:rPr>
           <w:rFonts w:ascii="Times New Roman" w:hAnsi="Times New Roman" w:cs="Times New Roman"/>
@@ -278,14 +245,7 @@
         <w:rPr>
           <w:rFonts w:ascii="Times New Roman" w:hAnsi="Times New Roman" w:cs="Times New Roman"/>
         </w:rPr>
-        <w:t xml:space="preserve"> .filter</w:t>
-      </w:r>
-      <w:proofErr w:type="gramEnd"/>
-      <w:r>
-        <w:rPr>
-          <w:rFonts w:ascii="Times New Roman" w:hAnsi="Times New Roman" w:cs="Times New Roman"/>
-        </w:rPr>
-        <w:t xml:space="preserve">() pada data </w:t>
+        <w:t xml:space="preserve"> .filter() pada data </w:t>
       </w:r>
       <w:proofErr w:type="spellStart"/>
       <w:r>
@@ -2672,6 +2632,7 @@
       <w:r>
         <w:rPr>
           <w:rFonts w:ascii="Times New Roman" w:hAnsi="Times New Roman" w:cs="Times New Roman"/>
+          <w:noProof/>
         </w:rPr>
         <w:drawing>
           <wp:inline distT="0" distB="0" distL="0" distR="0" wp14:anchorId="32A902C9" wp14:editId="15B3AE51">
@@ -3203,6 +3164,764 @@
         </w:rPr>
         <w:t>.</w:t>
       </w:r>
+    </w:p>
+    <w:p>
+      <w:pPr>
+        <w:pStyle w:val="ListParagraph"/>
+        <w:jc w:val="both"/>
+        <w:rPr>
+          <w:rFonts w:ascii="Times New Roman" w:hAnsi="Times New Roman" w:cs="Times New Roman"/>
+        </w:rPr>
+      </w:pPr>
+    </w:p>
+    <w:p>
+      <w:pPr>
+        <w:pStyle w:val="ListParagraph"/>
+        <w:jc w:val="both"/>
+        <w:rPr>
+          <w:rFonts w:ascii="Times New Roman" w:hAnsi="Times New Roman" w:cs="Times New Roman"/>
+        </w:rPr>
+      </w:pPr>
+      <w:r>
+        <w:rPr>
+          <w:rFonts w:ascii="Times New Roman" w:hAnsi="Times New Roman" w:cs="Times New Roman"/>
+        </w:rPr>
+        <w:t xml:space="preserve">7. Dashboard </w:t>
+      </w:r>
+      <w:proofErr w:type="spellStart"/>
+      <w:r>
+        <w:rPr>
+          <w:rFonts w:ascii="Times New Roman" w:hAnsi="Times New Roman" w:cs="Times New Roman"/>
+        </w:rPr>
+        <w:t>Tiket</w:t>
+      </w:r>
+      <w:proofErr w:type="spellEnd"/>
+      <w:r>
+        <w:rPr>
+          <w:rFonts w:ascii="Times New Roman" w:hAnsi="Times New Roman" w:cs="Times New Roman"/>
+        </w:rPr>
+        <w:t xml:space="preserve"> Admin</w:t>
+      </w:r>
+    </w:p>
+    <w:p>
+      <w:pPr>
+        <w:pStyle w:val="ListParagraph"/>
+        <w:jc w:val="both"/>
+        <w:rPr>
+          <w:rFonts w:ascii="Times New Roman" w:hAnsi="Times New Roman" w:cs="Times New Roman"/>
+        </w:rPr>
+      </w:pPr>
+      <w:r>
+        <w:rPr>
+          <w:rFonts w:ascii="Times New Roman" w:hAnsi="Times New Roman" w:cs="Times New Roman"/>
+        </w:rPr>
+        <w:drawing>
+          <wp:inline distT="0" distB="0" distL="0" distR="0" wp14:anchorId="1303D629" wp14:editId="5EB2E46F">
+            <wp:extent cx="5943600" cy="2914650"/>
+            <wp:effectExtent l="0" t="0" r="0" b="0"/>
+            <wp:docPr id="754674318" name="Picture 1"/>
+            <wp:cNvGraphicFramePr>
+              <a:graphicFrameLocks xmlns:a="http://schemas.openxmlformats.org/drawingml/2006/main" noChangeAspect="1"/>
+            </wp:cNvGraphicFramePr>
+            <a:graphic xmlns:a="http://schemas.openxmlformats.org/drawingml/2006/main">
+              <a:graphicData uri="http://schemas.openxmlformats.org/drawingml/2006/picture">
+                <pic:pic xmlns:pic="http://schemas.openxmlformats.org/drawingml/2006/picture">
+                  <pic:nvPicPr>
+                    <pic:cNvPr id="754674318" name=""/>
+                    <pic:cNvPicPr/>
+                  </pic:nvPicPr>
+                  <pic:blipFill rotWithShape="1">
+                    <a:blip r:embed="rId13"/>
+                    <a:srcRect t="6267" b="6553"/>
+                    <a:stretch>
+                      <a:fillRect/>
+                    </a:stretch>
+                  </pic:blipFill>
+                  <pic:spPr bwMode="auto">
+                    <a:xfrm>
+                      <a:off x="0" y="0"/>
+                      <a:ext cx="5943600" cy="2914650"/>
+                    </a:xfrm>
+                    <a:prstGeom prst="rect">
+                      <a:avLst/>
+                    </a:prstGeom>
+                    <a:ln>
+                      <a:noFill/>
+                    </a:ln>
+                    <a:extLst>
+                      <a:ext uri="{53640926-AAD7-44D8-BBD7-CCE9431645EC}">
+                        <a14:shadowObscured xmlns:a14="http://schemas.microsoft.com/office/drawing/2010/main"/>
+                      </a:ext>
+                    </a:extLst>
+                  </pic:spPr>
+                </pic:pic>
+              </a:graphicData>
+            </a:graphic>
+          </wp:inline>
+        </w:drawing>
+      </w:r>
+    </w:p>
+    <w:p>
+      <w:pPr>
+        <w:ind w:left="720"/>
+        <w:jc w:val="both"/>
+        <w:rPr>
+          <w:rFonts w:ascii="Times New Roman" w:hAnsi="Times New Roman" w:cs="Times New Roman"/>
+        </w:rPr>
+      </w:pPr>
+      <w:proofErr w:type="spellStart"/>
+      <w:r>
+        <w:rPr>
+          <w:rFonts w:ascii="Times New Roman" w:hAnsi="Times New Roman" w:cs="Times New Roman"/>
+        </w:rPr>
+        <w:lastRenderedPageBreak/>
+        <w:t>Berhasil</w:t>
+      </w:r>
+      <w:proofErr w:type="spellEnd"/>
+      <w:r>
+        <w:rPr>
+          <w:rFonts w:ascii="Times New Roman" w:hAnsi="Times New Roman" w:cs="Times New Roman"/>
+        </w:rPr>
+        <w:t xml:space="preserve"> </w:t>
+      </w:r>
+      <w:proofErr w:type="spellStart"/>
+      <w:r>
+        <w:rPr>
+          <w:rFonts w:ascii="Times New Roman" w:hAnsi="Times New Roman" w:cs="Times New Roman"/>
+        </w:rPr>
+        <w:t>mengimplementasikan</w:t>
+      </w:r>
+      <w:proofErr w:type="spellEnd"/>
+      <w:r>
+        <w:rPr>
+          <w:rFonts w:ascii="Times New Roman" w:hAnsi="Times New Roman" w:cs="Times New Roman"/>
+        </w:rPr>
+        <w:t xml:space="preserve"> </w:t>
+      </w:r>
+      <w:proofErr w:type="spellStart"/>
+      <w:r>
+        <w:rPr>
+          <w:rFonts w:ascii="Times New Roman" w:hAnsi="Times New Roman" w:cs="Times New Roman"/>
+        </w:rPr>
+        <w:t>halaman</w:t>
+      </w:r>
+      <w:proofErr w:type="spellEnd"/>
+      <w:r>
+        <w:rPr>
+          <w:rFonts w:ascii="Times New Roman" w:hAnsi="Times New Roman" w:cs="Times New Roman"/>
+        </w:rPr>
+        <w:t xml:space="preserve"> </w:t>
+      </w:r>
+      <w:proofErr w:type="spellStart"/>
+      <w:r>
+        <w:rPr>
+          <w:rFonts w:ascii="Times New Roman" w:hAnsi="Times New Roman" w:cs="Times New Roman"/>
+        </w:rPr>
+        <w:t>khusus</w:t>
+      </w:r>
+      <w:proofErr w:type="spellEnd"/>
+      <w:r>
+        <w:rPr>
+          <w:rFonts w:ascii="Times New Roman" w:hAnsi="Times New Roman" w:cs="Times New Roman"/>
+        </w:rPr>
+        <w:t xml:space="preserve"> </w:t>
+      </w:r>
+      <w:proofErr w:type="spellStart"/>
+      <w:r>
+        <w:rPr>
+          <w:rFonts w:ascii="Times New Roman" w:hAnsi="Times New Roman" w:cs="Times New Roman"/>
+        </w:rPr>
+        <w:t>bagi</w:t>
+      </w:r>
+      <w:proofErr w:type="spellEnd"/>
+      <w:r>
+        <w:rPr>
+          <w:rFonts w:ascii="Times New Roman" w:hAnsi="Times New Roman" w:cs="Times New Roman"/>
+        </w:rPr>
+        <w:t xml:space="preserve"> admin </w:t>
+      </w:r>
+      <w:proofErr w:type="spellStart"/>
+      <w:r>
+        <w:rPr>
+          <w:rFonts w:ascii="Times New Roman" w:hAnsi="Times New Roman" w:cs="Times New Roman"/>
+        </w:rPr>
+        <w:t>untuk</w:t>
+      </w:r>
+      <w:proofErr w:type="spellEnd"/>
+      <w:r>
+        <w:rPr>
+          <w:rFonts w:ascii="Times New Roman" w:hAnsi="Times New Roman" w:cs="Times New Roman"/>
+        </w:rPr>
+        <w:t xml:space="preserve"> </w:t>
+      </w:r>
+      <w:proofErr w:type="spellStart"/>
+      <w:r>
+        <w:rPr>
+          <w:rFonts w:ascii="Times New Roman" w:hAnsi="Times New Roman" w:cs="Times New Roman"/>
+        </w:rPr>
+        <w:t>memantau</w:t>
+      </w:r>
+      <w:proofErr w:type="spellEnd"/>
+      <w:r>
+        <w:rPr>
+          <w:rFonts w:ascii="Times New Roman" w:hAnsi="Times New Roman" w:cs="Times New Roman"/>
+        </w:rPr>
+        <w:t xml:space="preserve"> </w:t>
+      </w:r>
+      <w:proofErr w:type="spellStart"/>
+      <w:r>
+        <w:rPr>
+          <w:rFonts w:ascii="Times New Roman" w:hAnsi="Times New Roman" w:cs="Times New Roman"/>
+        </w:rPr>
+        <w:t>seluruh</w:t>
+      </w:r>
+      <w:proofErr w:type="spellEnd"/>
+      <w:r>
+        <w:rPr>
+          <w:rFonts w:ascii="Times New Roman" w:hAnsi="Times New Roman" w:cs="Times New Roman"/>
+        </w:rPr>
+        <w:t xml:space="preserve"> data </w:t>
+      </w:r>
+      <w:proofErr w:type="spellStart"/>
+      <w:r>
+        <w:rPr>
+          <w:rFonts w:ascii="Times New Roman" w:hAnsi="Times New Roman" w:cs="Times New Roman"/>
+        </w:rPr>
+        <w:t>transaksi</w:t>
+      </w:r>
+      <w:proofErr w:type="spellEnd"/>
+      <w:r>
+        <w:rPr>
+          <w:rFonts w:ascii="Times New Roman" w:hAnsi="Times New Roman" w:cs="Times New Roman"/>
+        </w:rPr>
+        <w:t xml:space="preserve"> </w:t>
+      </w:r>
+      <w:proofErr w:type="spellStart"/>
+      <w:r>
+        <w:rPr>
+          <w:rFonts w:ascii="Times New Roman" w:hAnsi="Times New Roman" w:cs="Times New Roman"/>
+        </w:rPr>
+        <w:t>tiket</w:t>
+      </w:r>
+      <w:proofErr w:type="spellEnd"/>
+      <w:r>
+        <w:rPr>
+          <w:rFonts w:ascii="Times New Roman" w:hAnsi="Times New Roman" w:cs="Times New Roman"/>
+        </w:rPr>
+        <w:t xml:space="preserve"> </w:t>
+      </w:r>
+      <w:proofErr w:type="spellStart"/>
+      <w:r>
+        <w:rPr>
+          <w:rFonts w:ascii="Times New Roman" w:hAnsi="Times New Roman" w:cs="Times New Roman"/>
+        </w:rPr>
+        <w:t>secara</w:t>
+      </w:r>
+      <w:proofErr w:type="spellEnd"/>
+      <w:r>
+        <w:rPr>
+          <w:rFonts w:ascii="Times New Roman" w:hAnsi="Times New Roman" w:cs="Times New Roman"/>
+        </w:rPr>
+        <w:t xml:space="preserve"> </w:t>
+      </w:r>
+      <w:proofErr w:type="spellStart"/>
+      <w:r>
+        <w:rPr>
+          <w:rFonts w:ascii="Times New Roman" w:hAnsi="Times New Roman" w:cs="Times New Roman"/>
+        </w:rPr>
+        <w:t>terpusat</w:t>
+      </w:r>
+      <w:proofErr w:type="spellEnd"/>
+      <w:r>
+        <w:rPr>
+          <w:rFonts w:ascii="Times New Roman" w:hAnsi="Times New Roman" w:cs="Times New Roman"/>
+        </w:rPr>
+        <w:t xml:space="preserve">. Halaman </w:t>
+      </w:r>
+      <w:proofErr w:type="spellStart"/>
+      <w:r>
+        <w:rPr>
+          <w:rFonts w:ascii="Times New Roman" w:hAnsi="Times New Roman" w:cs="Times New Roman"/>
+        </w:rPr>
+        <w:t>ini</w:t>
+      </w:r>
+      <w:proofErr w:type="spellEnd"/>
+      <w:r>
+        <w:rPr>
+          <w:rFonts w:ascii="Times New Roman" w:hAnsi="Times New Roman" w:cs="Times New Roman"/>
+        </w:rPr>
+        <w:t xml:space="preserve"> </w:t>
+      </w:r>
+      <w:proofErr w:type="spellStart"/>
+      <w:r>
+        <w:rPr>
+          <w:rFonts w:ascii="Times New Roman" w:hAnsi="Times New Roman" w:cs="Times New Roman"/>
+        </w:rPr>
+        <w:t>menyajikan</w:t>
+      </w:r>
+      <w:proofErr w:type="spellEnd"/>
+      <w:r>
+        <w:rPr>
+          <w:rFonts w:ascii="Times New Roman" w:hAnsi="Times New Roman" w:cs="Times New Roman"/>
+        </w:rPr>
+        <w:t xml:space="preserve"> </w:t>
+      </w:r>
+      <w:proofErr w:type="spellStart"/>
+      <w:r>
+        <w:rPr>
+          <w:rFonts w:ascii="Times New Roman" w:hAnsi="Times New Roman" w:cs="Times New Roman"/>
+        </w:rPr>
+        <w:t>informasi</w:t>
+      </w:r>
+      <w:proofErr w:type="spellEnd"/>
+      <w:r>
+        <w:rPr>
+          <w:rFonts w:ascii="Times New Roman" w:hAnsi="Times New Roman" w:cs="Times New Roman"/>
+        </w:rPr>
+        <w:t xml:space="preserve"> detail </w:t>
+      </w:r>
+      <w:proofErr w:type="spellStart"/>
+      <w:r>
+        <w:rPr>
+          <w:rFonts w:ascii="Times New Roman" w:hAnsi="Times New Roman" w:cs="Times New Roman"/>
+        </w:rPr>
+        <w:t>mengenai</w:t>
+      </w:r>
+      <w:proofErr w:type="spellEnd"/>
+      <w:r>
+        <w:rPr>
+          <w:rFonts w:ascii="Times New Roman" w:hAnsi="Times New Roman" w:cs="Times New Roman"/>
+        </w:rPr>
+        <w:t xml:space="preserve"> </w:t>
+      </w:r>
+      <w:proofErr w:type="spellStart"/>
+      <w:r>
+        <w:rPr>
+          <w:rFonts w:ascii="Times New Roman" w:hAnsi="Times New Roman" w:cs="Times New Roman"/>
+        </w:rPr>
+        <w:t>setiap</w:t>
+      </w:r>
+      <w:proofErr w:type="spellEnd"/>
+      <w:r>
+        <w:rPr>
+          <w:rFonts w:ascii="Times New Roman" w:hAnsi="Times New Roman" w:cs="Times New Roman"/>
+        </w:rPr>
+        <w:t xml:space="preserve"> </w:t>
+      </w:r>
+      <w:proofErr w:type="spellStart"/>
+      <w:r>
+        <w:rPr>
+          <w:rFonts w:ascii="Times New Roman" w:hAnsi="Times New Roman" w:cs="Times New Roman"/>
+        </w:rPr>
+        <w:t>pembelian</w:t>
+      </w:r>
+      <w:proofErr w:type="spellEnd"/>
+      <w:r>
+        <w:rPr>
+          <w:rFonts w:ascii="Times New Roman" w:hAnsi="Times New Roman" w:cs="Times New Roman"/>
+        </w:rPr>
+        <w:t xml:space="preserve">, </w:t>
+      </w:r>
+      <w:proofErr w:type="spellStart"/>
+      <w:r>
+        <w:rPr>
+          <w:rFonts w:ascii="Times New Roman" w:hAnsi="Times New Roman" w:cs="Times New Roman"/>
+        </w:rPr>
+        <w:t>meliputi</w:t>
+      </w:r>
+      <w:proofErr w:type="spellEnd"/>
+      <w:r>
+        <w:rPr>
+          <w:rFonts w:ascii="Times New Roman" w:hAnsi="Times New Roman" w:cs="Times New Roman"/>
+        </w:rPr>
+        <w:t xml:space="preserve"> </w:t>
+      </w:r>
+      <w:proofErr w:type="spellStart"/>
+      <w:r>
+        <w:rPr>
+          <w:rFonts w:ascii="Times New Roman" w:hAnsi="Times New Roman" w:cs="Times New Roman"/>
+        </w:rPr>
+        <w:t>kode</w:t>
+      </w:r>
+      <w:proofErr w:type="spellEnd"/>
+      <w:r>
+        <w:rPr>
+          <w:rFonts w:ascii="Times New Roman" w:hAnsi="Times New Roman" w:cs="Times New Roman"/>
+        </w:rPr>
+        <w:t xml:space="preserve"> booking, </w:t>
+      </w:r>
+      <w:proofErr w:type="spellStart"/>
+      <w:r>
+        <w:rPr>
+          <w:rFonts w:ascii="Times New Roman" w:hAnsi="Times New Roman" w:cs="Times New Roman"/>
+        </w:rPr>
+        <w:t>identitas</w:t>
+      </w:r>
+      <w:proofErr w:type="spellEnd"/>
+      <w:r>
+        <w:rPr>
+          <w:rFonts w:ascii="Times New Roman" w:hAnsi="Times New Roman" w:cs="Times New Roman"/>
+        </w:rPr>
+        <w:t xml:space="preserve"> </w:t>
+      </w:r>
+      <w:proofErr w:type="spellStart"/>
+      <w:r>
+        <w:rPr>
+          <w:rFonts w:ascii="Times New Roman" w:hAnsi="Times New Roman" w:cs="Times New Roman"/>
+        </w:rPr>
+        <w:t>pemesan</w:t>
+      </w:r>
+      <w:proofErr w:type="spellEnd"/>
+      <w:r>
+        <w:rPr>
+          <w:rFonts w:ascii="Times New Roman" w:hAnsi="Times New Roman" w:cs="Times New Roman"/>
+        </w:rPr>
+        <w:t xml:space="preserve">, </w:t>
+      </w:r>
+      <w:proofErr w:type="spellStart"/>
+      <w:r>
+        <w:rPr>
+          <w:rFonts w:ascii="Times New Roman" w:hAnsi="Times New Roman" w:cs="Times New Roman"/>
+        </w:rPr>
+        <w:t>jenis</w:t>
+      </w:r>
+      <w:proofErr w:type="spellEnd"/>
+      <w:r>
+        <w:rPr>
+          <w:rFonts w:ascii="Times New Roman" w:hAnsi="Times New Roman" w:cs="Times New Roman"/>
+        </w:rPr>
+        <w:t xml:space="preserve"> </w:t>
+      </w:r>
+      <w:proofErr w:type="spellStart"/>
+      <w:r>
+        <w:rPr>
+          <w:rFonts w:ascii="Times New Roman" w:hAnsi="Times New Roman" w:cs="Times New Roman"/>
+        </w:rPr>
+        <w:t>tiket</w:t>
+      </w:r>
+      <w:proofErr w:type="spellEnd"/>
+      <w:r>
+        <w:rPr>
+          <w:rFonts w:ascii="Times New Roman" w:hAnsi="Times New Roman" w:cs="Times New Roman"/>
+        </w:rPr>
+        <w:t xml:space="preserve">, </w:t>
+      </w:r>
+      <w:proofErr w:type="spellStart"/>
+      <w:r>
+        <w:rPr>
+          <w:rFonts w:ascii="Times New Roman" w:hAnsi="Times New Roman" w:cs="Times New Roman"/>
+        </w:rPr>
+        <w:t>hingga</w:t>
+      </w:r>
+      <w:proofErr w:type="spellEnd"/>
+      <w:r>
+        <w:rPr>
+          <w:rFonts w:ascii="Times New Roman" w:hAnsi="Times New Roman" w:cs="Times New Roman"/>
+        </w:rPr>
+        <w:t xml:space="preserve"> total </w:t>
+      </w:r>
+      <w:proofErr w:type="spellStart"/>
+      <w:r>
+        <w:rPr>
+          <w:rFonts w:ascii="Times New Roman" w:hAnsi="Times New Roman" w:cs="Times New Roman"/>
+        </w:rPr>
+        <w:t>pembayaran</w:t>
+      </w:r>
+      <w:proofErr w:type="spellEnd"/>
+      <w:r>
+        <w:rPr>
+          <w:rFonts w:ascii="Times New Roman" w:hAnsi="Times New Roman" w:cs="Times New Roman"/>
+        </w:rPr>
+        <w:t xml:space="preserve">. Selain </w:t>
+      </w:r>
+      <w:proofErr w:type="spellStart"/>
+      <w:r>
+        <w:rPr>
+          <w:rFonts w:ascii="Times New Roman" w:hAnsi="Times New Roman" w:cs="Times New Roman"/>
+        </w:rPr>
+        <w:t>itu</w:t>
+      </w:r>
+      <w:proofErr w:type="spellEnd"/>
+      <w:r>
+        <w:rPr>
+          <w:rFonts w:ascii="Times New Roman" w:hAnsi="Times New Roman" w:cs="Times New Roman"/>
+        </w:rPr>
+        <w:t xml:space="preserve">, </w:t>
+      </w:r>
+      <w:proofErr w:type="spellStart"/>
+      <w:r>
+        <w:rPr>
+          <w:rFonts w:ascii="Times New Roman" w:hAnsi="Times New Roman" w:cs="Times New Roman"/>
+        </w:rPr>
+        <w:t>fitur</w:t>
+      </w:r>
+      <w:proofErr w:type="spellEnd"/>
+      <w:r>
+        <w:rPr>
+          <w:rFonts w:ascii="Times New Roman" w:hAnsi="Times New Roman" w:cs="Times New Roman"/>
+        </w:rPr>
+        <w:t xml:space="preserve"> </w:t>
+      </w:r>
+      <w:proofErr w:type="spellStart"/>
+      <w:r>
+        <w:rPr>
+          <w:rFonts w:ascii="Times New Roman" w:hAnsi="Times New Roman" w:cs="Times New Roman"/>
+        </w:rPr>
+        <w:t>ini</w:t>
+      </w:r>
+      <w:proofErr w:type="spellEnd"/>
+      <w:r>
+        <w:rPr>
+          <w:rFonts w:ascii="Times New Roman" w:hAnsi="Times New Roman" w:cs="Times New Roman"/>
+        </w:rPr>
+        <w:t xml:space="preserve"> </w:t>
+      </w:r>
+      <w:proofErr w:type="spellStart"/>
+      <w:r>
+        <w:rPr>
+          <w:rFonts w:ascii="Times New Roman" w:hAnsi="Times New Roman" w:cs="Times New Roman"/>
+        </w:rPr>
+        <w:t>dilengkapi</w:t>
+      </w:r>
+      <w:proofErr w:type="spellEnd"/>
+      <w:r>
+        <w:rPr>
+          <w:rFonts w:ascii="Times New Roman" w:hAnsi="Times New Roman" w:cs="Times New Roman"/>
+        </w:rPr>
+        <w:t xml:space="preserve"> </w:t>
+      </w:r>
+      <w:proofErr w:type="spellStart"/>
+      <w:r>
+        <w:rPr>
+          <w:rFonts w:ascii="Times New Roman" w:hAnsi="Times New Roman" w:cs="Times New Roman"/>
+        </w:rPr>
+        <w:t>dengan</w:t>
+      </w:r>
+      <w:proofErr w:type="spellEnd"/>
+      <w:r>
+        <w:rPr>
+          <w:rFonts w:ascii="Times New Roman" w:hAnsi="Times New Roman" w:cs="Times New Roman"/>
+        </w:rPr>
+        <w:t xml:space="preserve"> </w:t>
+      </w:r>
+      <w:proofErr w:type="spellStart"/>
+      <w:r>
+        <w:rPr>
+          <w:rFonts w:ascii="Times New Roman" w:hAnsi="Times New Roman" w:cs="Times New Roman"/>
+        </w:rPr>
+        <w:t>fungsi</w:t>
+      </w:r>
+      <w:proofErr w:type="spellEnd"/>
+      <w:r>
+        <w:rPr>
+          <w:rFonts w:ascii="Times New Roman" w:hAnsi="Times New Roman" w:cs="Times New Roman"/>
+        </w:rPr>
+        <w:t xml:space="preserve"> </w:t>
+      </w:r>
+      <w:proofErr w:type="spellStart"/>
+      <w:r>
+        <w:rPr>
+          <w:rFonts w:ascii="Times New Roman" w:hAnsi="Times New Roman" w:cs="Times New Roman"/>
+        </w:rPr>
+        <w:t>penghapusan</w:t>
+      </w:r>
+      <w:proofErr w:type="spellEnd"/>
+      <w:r>
+        <w:rPr>
+          <w:rFonts w:ascii="Times New Roman" w:hAnsi="Times New Roman" w:cs="Times New Roman"/>
+        </w:rPr>
+        <w:t xml:space="preserve"> data </w:t>
+      </w:r>
+      <w:proofErr w:type="spellStart"/>
+      <w:r>
+        <w:rPr>
+          <w:rFonts w:ascii="Times New Roman" w:hAnsi="Times New Roman" w:cs="Times New Roman"/>
+        </w:rPr>
+        <w:t>untuk</w:t>
+      </w:r>
+      <w:proofErr w:type="spellEnd"/>
+      <w:r>
+        <w:rPr>
+          <w:rFonts w:ascii="Times New Roman" w:hAnsi="Times New Roman" w:cs="Times New Roman"/>
+        </w:rPr>
+        <w:t xml:space="preserve"> </w:t>
+      </w:r>
+      <w:proofErr w:type="spellStart"/>
+      <w:r>
+        <w:rPr>
+          <w:rFonts w:ascii="Times New Roman" w:hAnsi="Times New Roman" w:cs="Times New Roman"/>
+        </w:rPr>
+        <w:t>menjaga</w:t>
+      </w:r>
+      <w:proofErr w:type="spellEnd"/>
+      <w:r>
+        <w:rPr>
+          <w:rFonts w:ascii="Times New Roman" w:hAnsi="Times New Roman" w:cs="Times New Roman"/>
+        </w:rPr>
+        <w:t xml:space="preserve"> </w:t>
+      </w:r>
+      <w:proofErr w:type="spellStart"/>
+      <w:r>
+        <w:rPr>
+          <w:rFonts w:ascii="Times New Roman" w:hAnsi="Times New Roman" w:cs="Times New Roman"/>
+        </w:rPr>
+        <w:t>kerapian</w:t>
+      </w:r>
+      <w:proofErr w:type="spellEnd"/>
+      <w:r>
+        <w:rPr>
+          <w:rFonts w:ascii="Times New Roman" w:hAnsi="Times New Roman" w:cs="Times New Roman"/>
+        </w:rPr>
+        <w:t xml:space="preserve"> basis data. </w:t>
+      </w:r>
+      <w:proofErr w:type="spellStart"/>
+      <w:r>
+        <w:rPr>
+          <w:rFonts w:ascii="Times New Roman" w:hAnsi="Times New Roman" w:cs="Times New Roman"/>
+        </w:rPr>
+        <w:t>Implementasi</w:t>
+      </w:r>
+      <w:proofErr w:type="spellEnd"/>
+      <w:r>
+        <w:rPr>
+          <w:rFonts w:ascii="Times New Roman" w:hAnsi="Times New Roman" w:cs="Times New Roman"/>
+        </w:rPr>
+        <w:t xml:space="preserve"> </w:t>
+      </w:r>
+      <w:proofErr w:type="spellStart"/>
+      <w:r>
+        <w:rPr>
+          <w:rFonts w:ascii="Times New Roman" w:hAnsi="Times New Roman" w:cs="Times New Roman"/>
+        </w:rPr>
+        <w:t>ini</w:t>
+      </w:r>
+      <w:proofErr w:type="spellEnd"/>
+      <w:r>
+        <w:rPr>
+          <w:rFonts w:ascii="Times New Roman" w:hAnsi="Times New Roman" w:cs="Times New Roman"/>
+        </w:rPr>
+        <w:t xml:space="preserve"> </w:t>
+      </w:r>
+      <w:proofErr w:type="spellStart"/>
+      <w:r>
+        <w:rPr>
+          <w:rFonts w:ascii="Times New Roman" w:hAnsi="Times New Roman" w:cs="Times New Roman"/>
+        </w:rPr>
+        <w:t>memudahkan</w:t>
+      </w:r>
+      <w:proofErr w:type="spellEnd"/>
+      <w:r>
+        <w:rPr>
+          <w:rFonts w:ascii="Times New Roman" w:hAnsi="Times New Roman" w:cs="Times New Roman"/>
+        </w:rPr>
+        <w:t xml:space="preserve"> admin </w:t>
+      </w:r>
+      <w:proofErr w:type="spellStart"/>
+      <w:r>
+        <w:rPr>
+          <w:rFonts w:ascii="Times New Roman" w:hAnsi="Times New Roman" w:cs="Times New Roman"/>
+        </w:rPr>
+        <w:t>dalam</w:t>
+      </w:r>
+      <w:proofErr w:type="spellEnd"/>
+      <w:r>
+        <w:rPr>
+          <w:rFonts w:ascii="Times New Roman" w:hAnsi="Times New Roman" w:cs="Times New Roman"/>
+        </w:rPr>
+        <w:t xml:space="preserve"> </w:t>
+      </w:r>
+      <w:proofErr w:type="spellStart"/>
+      <w:r>
+        <w:rPr>
+          <w:rFonts w:ascii="Times New Roman" w:hAnsi="Times New Roman" w:cs="Times New Roman"/>
+        </w:rPr>
+        <w:t>melakukan</w:t>
+      </w:r>
+      <w:proofErr w:type="spellEnd"/>
+      <w:r>
+        <w:rPr>
+          <w:rFonts w:ascii="Times New Roman" w:hAnsi="Times New Roman" w:cs="Times New Roman"/>
+        </w:rPr>
+        <w:t xml:space="preserve"> </w:t>
+      </w:r>
+      <w:proofErr w:type="spellStart"/>
+      <w:r>
+        <w:rPr>
+          <w:rFonts w:ascii="Times New Roman" w:hAnsi="Times New Roman" w:cs="Times New Roman"/>
+        </w:rPr>
+        <w:t>verifikasi</w:t>
+      </w:r>
+      <w:proofErr w:type="spellEnd"/>
+      <w:r>
+        <w:rPr>
+          <w:rFonts w:ascii="Times New Roman" w:hAnsi="Times New Roman" w:cs="Times New Roman"/>
+        </w:rPr>
+        <w:t xml:space="preserve"> </w:t>
+      </w:r>
+      <w:proofErr w:type="spellStart"/>
+      <w:r>
+        <w:rPr>
+          <w:rFonts w:ascii="Times New Roman" w:hAnsi="Times New Roman" w:cs="Times New Roman"/>
+        </w:rPr>
+        <w:t>transaksi</w:t>
+      </w:r>
+      <w:proofErr w:type="spellEnd"/>
+      <w:r>
+        <w:rPr>
+          <w:rFonts w:ascii="Times New Roman" w:hAnsi="Times New Roman" w:cs="Times New Roman"/>
+        </w:rPr>
+        <w:t xml:space="preserve"> dan </w:t>
+      </w:r>
+      <w:proofErr w:type="spellStart"/>
+      <w:r>
+        <w:rPr>
+          <w:rFonts w:ascii="Times New Roman" w:hAnsi="Times New Roman" w:cs="Times New Roman"/>
+        </w:rPr>
+        <w:t>pengelolaan</w:t>
+      </w:r>
+      <w:proofErr w:type="spellEnd"/>
+      <w:r>
+        <w:rPr>
+          <w:rFonts w:ascii="Times New Roman" w:hAnsi="Times New Roman" w:cs="Times New Roman"/>
+        </w:rPr>
+        <w:t xml:space="preserve"> data </w:t>
+      </w:r>
+      <w:proofErr w:type="spellStart"/>
+      <w:r>
+        <w:rPr>
+          <w:rFonts w:ascii="Times New Roman" w:hAnsi="Times New Roman" w:cs="Times New Roman"/>
+        </w:rPr>
+        <w:t>pengunjung</w:t>
+      </w:r>
+      <w:proofErr w:type="spellEnd"/>
+      <w:r>
+        <w:rPr>
+          <w:rFonts w:ascii="Times New Roman" w:hAnsi="Times New Roman" w:cs="Times New Roman"/>
+        </w:rPr>
+        <w:t xml:space="preserve"> </w:t>
+      </w:r>
+      <w:proofErr w:type="spellStart"/>
+      <w:r>
+        <w:rPr>
+          <w:rFonts w:ascii="Times New Roman" w:hAnsi="Times New Roman" w:cs="Times New Roman"/>
+        </w:rPr>
+        <w:t>secara</w:t>
+      </w:r>
+      <w:proofErr w:type="spellEnd"/>
+      <w:r>
+        <w:rPr>
+          <w:rFonts w:ascii="Times New Roman" w:hAnsi="Times New Roman" w:cs="Times New Roman"/>
+        </w:rPr>
+        <w:t xml:space="preserve"> </w:t>
+      </w:r>
+      <w:proofErr w:type="spellStart"/>
+      <w:r>
+        <w:rPr>
+          <w:rFonts w:ascii="Times New Roman" w:hAnsi="Times New Roman" w:cs="Times New Roman"/>
+        </w:rPr>
+        <w:t>efisien</w:t>
+      </w:r>
+      <w:proofErr w:type="spellEnd"/>
     </w:p>
     <w:sectPr>
       <w:pgSz w:w="12240" w:h="15840"/>

</xml_diff>